<commit_message>
Memoria §4.6 y diapositiva 14: '¿Por qué no basta un LLM?'
- MEMORIA §4.6: cinco diferencias examinables (procedencia auditable,
  falsabilidad — suspendió tres backtests en público, incertidumbre
  calibrada, reproducibilidad con tests, rechazo por diseño), los objetos
  entrenados que un tribunal puede examinar (elasticidad 0,91±0,19,
  cuantiles del abanico, residuales LOOCV, r=0,57 de permisos, y los
  modelos RECHAZADOS como conocimiento) y declaración de uso de IA:
  el LLM narra, el sistema calcula. Exportes docx/pdf regenerados
- Deck: diapositiva 14 con la tabla comparativa antes de conclusiones
  (verificada en PNG; el primer insert falló silencioso por whitespace
  y se detectó en la verificación visual)

Co-Authored-By: Claude Fable 5 <noreply@anthropic.com>
</commit_message>
<xml_diff>
--- a/docs/MEMORIA.docx
+++ b/docs/MEMORIA.docx
@@ -2,7 +2,7 @@
 <file path=word/document.xml><?xml version="1.0" encoding="utf-8"?>
 <w:document xmlns:w="http://schemas.openxmlformats.org/wordprocessingml/2006/main" xmlns:m="http://schemas.openxmlformats.org/officeDocument/2006/math" xmlns:r="http://schemas.openxmlformats.org/officeDocument/2006/relationships" xmlns:o="urn:schemas-microsoft-com:office:office" xmlns:v="urn:schemas-microsoft-com:vml" xmlns:w10="urn:schemas-microsoft-com:office:word" xmlns:a="http://schemas.openxmlformats.org/drawingml/2006/main" xmlns:pic="http://schemas.openxmlformats.org/drawingml/2006/picture" xmlns:wp="http://schemas.openxmlformats.org/drawingml/2006/wordprocessingDrawing">
   <w:body>
-    <w:bookmarkStart w:id="48" w:name="dinero-público-resultados"/>
+    <w:bookmarkStart w:id="49" w:name="dinero-público-resultados"/>
     <w:p>
       <w:pPr>
         <w:pStyle w:val="Heading1"/>
@@ -657,7 +657,7 @@
       </w:r>
     </w:p>
     <w:bookmarkEnd w:id="20"/>
-    <w:bookmarkStart w:id="42" w:name="resultados"/>
+    <w:bookmarkStart w:id="43" w:name="resultados"/>
     <w:p>
       <w:pPr>
         <w:pStyle w:val="Heading2"/>
@@ -1306,14 +1306,53 @@
       </w:r>
     </w:p>
     <w:bookmarkEnd w:id="41"/>
-    <w:bookmarkEnd w:id="42"/>
-    <w:bookmarkStart w:id="43" w:name="limitaciones"/>
-    <w:p>
-      <w:pPr>
-        <w:pStyle w:val="Heading2"/>
-      </w:pPr>
-      <w:r>
-        <w:t xml:space="preserve">5. Limitaciones</w:t>
+    <w:bookmarkStart w:id="42" w:name="por-qué-no-basta-un-llm"/>
+    <w:p>
+      <w:pPr>
+        <w:pStyle w:val="Heading3"/>
+      </w:pPr>
+      <w:r>
+        <w:t xml:space="preserve">4.6 ¿Por qué no basta un LLM?</w:t>
+      </w:r>
+    </w:p>
+    <w:p>
+      <w:pPr>
+        <w:pStyle w:val="FirstParagraph"/>
+      </w:pPr>
+      <w:r>
+        <w:t xml:space="preserve">La pregunta obligada hoy: ¿no respondería todo esto un modelo de lenguaje? No, y la diferencia es examinable. Un LLM produce números</w:t>
+      </w:r>
+      <w:r>
+        <w:t xml:space="preserve"> </w:t>
+      </w:r>
+      <w:r>
+        <w:rPr>
+          <w:i/>
+          <w:iCs/>
+        </w:rPr>
+        <w:t xml:space="preserve">recordados o patroneados del texto</w:t>
+      </w:r>
+      <w:r>
+        <w:t xml:space="preserve"> </w:t>
+      </w:r>
+      <w:r>
+        <w:t xml:space="preserve">con el que se entrenó; este sistema los</w:t>
+      </w:r>
+      <w:r>
+        <w:t xml:space="preserve"> </w:t>
+      </w:r>
+      <w:r>
+        <w:rPr>
+          <w:i/>
+          <w:iCs/>
+        </w:rPr>
+        <w:t xml:space="preserve">calcula</w:t>
+      </w:r>
+      <w:r>
+        <w:t xml:space="preserve"> </w:t>
+      </w:r>
+      <w:r>
+        <w:t xml:space="preserve">con estimadores específicos sobre datos con cadena de custodia. Cinco diferencias defendibles, cada una con evidencia propia del proyecto:</w:t>
       </w:r>
     </w:p>
     <w:p>
@@ -1329,10 +1368,25 @@
           <w:b/>
           <w:bCs/>
         </w:rPr>
-        <w:t xml:space="preserve">Causalidad</w:t>
-      </w:r>
-      <w:r>
-        <w:t xml:space="preserve">: todo el trabajo es asociativo y descriptivo; los retardos mitigan pero no resuelven la endogeneidad, y así se declara en cada pieza.</w:t>
+        <w:t xml:space="preserve">Procedencia auditable</w:t>
+      </w:r>
+      <w:r>
+        <w:t xml:space="preserve">: cada cifra traza hasta</w:t>
+      </w:r>
+      <w:r>
+        <w:t xml:space="preserve"> </w:t>
+      </w:r>
+      <w:r>
+        <w:rPr>
+          <w:rStyle w:val="VerbatimChar"/>
+        </w:rPr>
+        <w:t xml:space="preserve">vintage_manifest.csv</w:t>
+      </w:r>
+      <w:r>
+        <w:t xml:space="preserve"> </w:t>
+      </w:r>
+      <w:r>
+        <w:t xml:space="preserve">(URL y fecha de cada descarga). La proyección de deuda de Q1 del stress test sale de una edición del WEO que está EN el repositorio; la de un LLM, de una memoria no verificable anterior a su corte de entrenamiento.</w:t>
       </w:r>
     </w:p>
     <w:p>
@@ -1348,13 +1402,26 @@
           <w:b/>
           <w:bCs/>
         </w:rPr>
-        <w:t xml:space="preserve">El ratio de asequibilidad es un indicador aproximado</w:t>
-      </w:r>
-      <w:r>
-        <w:t xml:space="preserve"> </w:t>
-      </w:r>
-      <w:r>
-        <w:t xml:space="preserve">de evolución relativa (no incorpora €/m², renta disponible, entrada ni financiación); el complemento de cuota hipotecaria teórica está especificado y pendiente del precio por m².</w:t>
+        <w:t xml:space="preserve">Falsabilidad</w:t>
+      </w:r>
+      <w:r>
+        <w:t xml:space="preserve">: las afirmaciones de rendimiento se puntúan out-of-sample (rolling-origin + test final de un solo uso). La mejor prueba de que la evaluación es real es que los modelos propios la</w:t>
+      </w:r>
+      <w:r>
+        <w:t xml:space="preserve"> </w:t>
+      </w:r>
+      <w:r>
+        <w:rPr>
+          <w:b/>
+          <w:bCs/>
+        </w:rPr>
+        <w:t xml:space="preserve">suspendieron tres veces en público</w:t>
+      </w:r>
+      <w:r>
+        <w:t xml:space="preserve"> </w:t>
+      </w:r>
+      <w:r>
+        <w:t xml:space="preserve">— la respuesta de un LLM no puede suspender un backtest porque nunca se presenta a uno.</w:t>
       </w:r>
     </w:p>
     <w:p>
@@ -1370,10 +1437,26 @@
           <w:b/>
           <w:bCs/>
         </w:rPr>
-        <w:t xml:space="preserve">Regímenes</w:t>
-      </w:r>
-      <w:r>
-        <w:t xml:space="preserve">: el test final demostró que 2024–25 fue una aceleración fuera del régimen de entrenamiento — a 2 años vista, en cambios de régimen, la banda es la parte informativa del pronóstico, no el punto.</w:t>
+        <w:t xml:space="preserve">Incertidumbre calibrada</w:t>
+      </w:r>
+      <w:r>
+        <w:t xml:space="preserve">: las bandas del abanico son cuantiles de errores medidos, con cobertura comprobable; los intervalos de A1 son conformal por grupo de renta. Un LLM emite</w:t>
+      </w:r>
+      <w:r>
+        <w:t xml:space="preserve"> </w:t>
+      </w:r>
+      <w:r>
+        <w:rPr>
+          <w:i/>
+          <w:iCs/>
+        </w:rPr>
+        <w:t xml:space="preserve">tono</w:t>
+      </w:r>
+      <w:r>
+        <w:t xml:space="preserve"> </w:t>
+      </w:r>
+      <w:r>
+        <w:t xml:space="preserve">de confianza, no intervalos calibrados.</w:t>
       </w:r>
     </w:p>
     <w:p>
@@ -1389,13 +1472,10 @@
           <w:b/>
           <w:bCs/>
         </w:rPr>
-        <w:t xml:space="preserve">n pequeño en el análisis transversal</w:t>
-      </w:r>
-      <w:r>
-        <w:t xml:space="preserve"> </w:t>
-      </w:r>
-      <w:r>
-        <w:t xml:space="preserve">(164 países): gana lo simple y las bandas son anchas; el paso natural es el panel por bloques quinquenales.</w:t>
+        <w:t xml:space="preserve">Reproducibilidad</w:t>
+      </w:r>
+      <w:r>
+        <w:t xml:space="preserve">: mismo código + mismos datos → mismos números, con 51 tests que lo blindan (el tercer bug del parser lo cazó un test; el número erróneo de un LLM es silencioso para siempre).</w:t>
       </w:r>
     </w:p>
     <w:p>
@@ -1411,58 +1491,44 @@
           <w:b/>
           <w:bCs/>
         </w:rPr>
-        <w:t xml:space="preserve">El simulador es determinista y sin retroalimentaciones</w:t>
-      </w:r>
-      <w:r>
-        <w:t xml:space="preserve">: mapa de sensibilidades, no pronóstico. Las bandas del motor de proyección usan el σ residual histórico y NO incluyen la incertidumbre de las elasticidades — los errores estándar agrupados por país son ≈2× los clásicos y así se reportan (la API lo declara en su respuesta).</w:t>
-      </w:r>
-      <w:r>
-        <w:t xml:space="preserve"> </w:t>
-      </w:r>
-      <w:r>
-        <w:t xml:space="preserve">5-bis.</w:t>
-      </w:r>
-      <w:r>
-        <w:t xml:space="preserve"> </w:t>
-      </w:r>
-      <w:r>
-        <w:rPr>
-          <w:b/>
-          <w:bCs/>
-        </w:rPr>
-        <w:t xml:space="preserve">Hiperparámetros sin optimizar</w:t>
-      </w:r>
-      <w:r>
-        <w:t xml:space="preserve">: los GBM usan configuraciones conservadoras por defecto; con tres rechazos consecutivos del modelo flexible bajo reglas pre-registradas, optimizarlos habría sido buscar la métrica, no la verdad — la decisión es deliberada y se declara.</w:t>
-      </w:r>
-    </w:p>
-    <w:p>
-      <w:pPr>
-        <w:pStyle w:val="Compact"/>
-        <w:numPr>
-          <w:ilvl w:val="0"/>
-          <w:numId w:val="1004"/>
-        </w:numPr>
-      </w:pPr>
-      <w:r>
-        <w:rPr>
-          <w:b/>
-          <w:bCs/>
-        </w:rPr>
-        <w:t xml:space="preserve">Falacia ecológica</w:t>
-      </w:r>
-      <w:r>
-        <w:t xml:space="preserve">: nada de lo dicho a nivel país habla de centros, sistemas o personas concretas.</w:t>
-      </w:r>
-    </w:p>
+        <w:t xml:space="preserve">Rechazo por diseño</w:t>
+      </w:r>
+      <w:r>
+        <w:t xml:space="preserve">: el reframe del Bloque D y los huecos declarados (déficit de vivienda, outcomes educativos) son arquitectura. Un LLM prescribe con soltura qué ministerios suprimir; este sistema pone precio a la pregunta (el 78 % del gasto) y devuelve la elección a la política.</w:t>
+      </w:r>
+    </w:p>
+    <w:p>
+      <w:pPr>
+        <w:pStyle w:val="FirstParagraph"/>
+      </w:pPr>
+      <w:r>
+        <w:t xml:space="preserve">Los objetos entrenados que un tribunal puede examinar: la elasticidad de las pensiones al envejecimiento (0,91 ± 0,19, SE agrupado), los cuantiles de error por horizonte que forman el abanico (aprendidos de 486 errores de backtesting), los residuales LOOCV con su semiancho conformal, la estructura adelantada de los permisos (r=0,57 a 11 trimestres) y los parámetros de los modelos evaluados y RECHAZADOS — el resultado negativo también es conocimiento entrenado.</w:t>
+      </w:r>
+    </w:p>
+    <w:p>
+      <w:pPr>
+        <w:pStyle w:val="BodyText"/>
+      </w:pPr>
+      <w:r>
+        <w:rPr>
+          <w:b/>
+          <w:bCs/>
+        </w:rPr>
+        <w:t xml:space="preserve">Declaración de uso de IA</w:t>
+      </w:r>
+      <w:r>
+        <w:t xml:space="preserve">: en este proyecto se emplearon asistentes LLM como herramienta de programación y redacción (proceso), nunca como fuente de los números (producto). El asistente RAG previsto como extensión es el papel correcto de un LLM aquí: interfaz de lenguaje natural SOBRE los artefactos calculados — el LLM narra, el sistema calcula.</w:t>
+      </w:r>
+    </w:p>
+    <w:bookmarkEnd w:id="42"/>
     <w:bookmarkEnd w:id="43"/>
-    <w:bookmarkStart w:id="44" w:name="conclusiones"/>
+    <w:bookmarkStart w:id="44" w:name="limitaciones"/>
     <w:p>
       <w:pPr>
         <w:pStyle w:val="Heading2"/>
       </w:pPr>
       <w:r>
-        <w:t xml:space="preserve">6. Conclusiones</w:t>
+        <w:t xml:space="preserve">5. Limitaciones</w:t>
       </w:r>
     </w:p>
     <w:p>
@@ -1474,7 +1540,14 @@
         </w:numPr>
       </w:pPr>
       <w:r>
-        <w:t xml:space="preserve">Es posible construir, solo con fuentes públicas y código abierto, un sistema completo — datos → modelos → producto — sobre una pregunta de interés público, con estándares de trazabilidad de nivel profesional (vintage, tests de contrato, resultados negativos publicados).</w:t>
+        <w:rPr>
+          <w:b/>
+          <w:bCs/>
+        </w:rPr>
+        <w:t xml:space="preserve">Causalidad</w:t>
+      </w:r>
+      <w:r>
+        <w:t xml:space="preserve">: todo el trabajo es asociativo y descriptivo; los retardos mitigan pero no resuelven la endogeneidad, y así se declara en cada pieza.</w:t>
       </w:r>
     </w:p>
     <w:p>
@@ -1490,10 +1563,13 @@
           <w:b/>
           <w:bCs/>
         </w:rPr>
-        <w:t xml:space="preserve">La aportación diferencial es la disciplina</w:t>
-      </w:r>
-      <w:r>
-        <w:t xml:space="preserve">: pre-registro, test único, y la voluntad de dejar que las reglas maten a los modelos atractivos. Tres veces ganó lo simple; una vez el protocolo evitó una predicción de desplome en pleno boom. En un TFM, donde la tentación es exhibir el modelo más complejo, este trabajo defiende lo contrario con evidencia propia.</w:t>
+        <w:t xml:space="preserve">El ratio de asequibilidad es un indicador aproximado</w:t>
+      </w:r>
+      <w:r>
+        <w:t xml:space="preserve"> </w:t>
+      </w:r>
+      <w:r>
+        <w:t xml:space="preserve">de evolución relativa (no incorpora €/m², renta disponible, entrada ni financiación); el complemento de cuota hipotecaria teórica está especificado y pendiente del precio por m².</w:t>
       </w:r>
     </w:p>
     <w:p>
@@ -1505,65 +1581,103 @@
         </w:numPr>
       </w:pPr>
       <w:r>
-        <w:t xml:space="preserve">Sustantivamente: la asequibilidad española no se corrige sola (ni con salarios al 4 %); la palanca pública de vivienda es un orden de magnitud menor que la promoción privada; la renta domina el rendimiento sanitario entre países; y la demografía domina la senda de deuda por encima de cualquier palanca fiscal individual.</w:t>
+        <w:rPr>
+          <w:b/>
+          <w:bCs/>
+        </w:rPr>
+        <w:t xml:space="preserve">Regímenes</w:t>
+      </w:r>
+      <w:r>
+        <w:t xml:space="preserve">: el test final demostró que 2024–25 fue una aceleración fuera del régimen de entrenamiento — a 2 años vista, en cambios de régimen, la banda es la parte informativa del pronóstico, no el punto.</w:t>
+      </w:r>
+    </w:p>
+    <w:p>
+      <w:pPr>
+        <w:pStyle w:val="Compact"/>
+        <w:numPr>
+          <w:ilvl w:val="0"/>
+          <w:numId w:val="1005"/>
+        </w:numPr>
+      </w:pPr>
+      <w:r>
+        <w:rPr>
+          <w:b/>
+          <w:bCs/>
+        </w:rPr>
+        <w:t xml:space="preserve">n pequeño en el análisis transversal</w:t>
+      </w:r>
+      <w:r>
+        <w:t xml:space="preserve"> </w:t>
+      </w:r>
+      <w:r>
+        <w:t xml:space="preserve">(164 países): gana lo simple y las bandas son anchas; el paso natural es el panel por bloques quinquenales.</w:t>
+      </w:r>
+    </w:p>
+    <w:p>
+      <w:pPr>
+        <w:pStyle w:val="Compact"/>
+        <w:numPr>
+          <w:ilvl w:val="0"/>
+          <w:numId w:val="1005"/>
+        </w:numPr>
+      </w:pPr>
+      <w:r>
+        <w:rPr>
+          <w:b/>
+          <w:bCs/>
+        </w:rPr>
+        <w:t xml:space="preserve">El simulador es determinista y sin retroalimentaciones</w:t>
+      </w:r>
+      <w:r>
+        <w:t xml:space="preserve">: mapa de sensibilidades, no pronóstico. Las bandas del motor de proyección usan el σ residual histórico y NO incluyen la incertidumbre de las elasticidades — los errores estándar agrupados por país son ≈2× los clásicos y así se reportan (la API lo declara en su respuesta).</w:t>
+      </w:r>
+      <w:r>
+        <w:t xml:space="preserve"> </w:t>
+      </w:r>
+      <w:r>
+        <w:t xml:space="preserve">5-bis.</w:t>
+      </w:r>
+      <w:r>
+        <w:t xml:space="preserve"> </w:t>
+      </w:r>
+      <w:r>
+        <w:rPr>
+          <w:b/>
+          <w:bCs/>
+        </w:rPr>
+        <w:t xml:space="preserve">Hiperparámetros sin optimizar</w:t>
+      </w:r>
+      <w:r>
+        <w:t xml:space="preserve">: los GBM usan configuraciones conservadoras por defecto; con tres rechazos consecutivos del modelo flexible bajo reglas pre-registradas, optimizarlos habría sido buscar la métrica, no la verdad — la decisión es deliberada y se declara.</w:t>
+      </w:r>
+    </w:p>
+    <w:p>
+      <w:pPr>
+        <w:pStyle w:val="Compact"/>
+        <w:numPr>
+          <w:ilvl w:val="0"/>
+          <w:numId w:val="1005"/>
+        </w:numPr>
+      </w:pPr>
+      <w:r>
+        <w:rPr>
+          <w:b/>
+          <w:bCs/>
+        </w:rPr>
+        <w:t xml:space="preserve">Falacia ecológica</w:t>
+      </w:r>
+      <w:r>
+        <w:t xml:space="preserve">: nada de lo dicho a nivel país habla de centros, sistemas o personas concretas.</w:t>
       </w:r>
     </w:p>
     <w:bookmarkEnd w:id="44"/>
-    <w:bookmarkStart w:id="45" w:name="trabajo-futuro"/>
+    <w:bookmarkStart w:id="45" w:name="conclusiones"/>
     <w:p>
       <w:pPr>
         <w:pStyle w:val="Heading2"/>
       </w:pPr>
       <w:r>
-        <w:t xml:space="preserve">7. Trabajo futuro</w:t>
-      </w:r>
-    </w:p>
-    <w:p>
-      <w:pPr>
-        <w:pStyle w:val="FirstParagraph"/>
-      </w:pPr>
-      <w:r>
-        <w:t xml:space="preserve">Pata provincial de visados (MITMA) y evaluación del driver de oferta con datos 2026+; cuota hipotecaria teórica con €/m²; panel quinquenal para A1 y módulos vivienda/educación; episodios históricos de consolidación (D2); actualización trimestral automática del pipeline; registro formal de modelos y versiones (hoy el versionado es git + artefactos gold, suficiente a esta escala pero explícitamente mínimo).</w:t>
-      </w:r>
-    </w:p>
-    <w:bookmarkEnd w:id="45"/>
-    <w:bookmarkStart w:id="46" w:name="referencias"/>
-    <w:p>
-      <w:pPr>
-        <w:pStyle w:val="Heading2"/>
-      </w:pPr>
-      <w:r>
-        <w:t xml:space="preserve">Referencias</w:t>
-      </w:r>
-    </w:p>
-    <w:p>
-      <w:pPr>
-        <w:pStyle w:val="FirstParagraph"/>
-      </w:pPr>
-      <w:r>
-        <w:rPr>
-          <w:b/>
-          <w:bCs/>
-        </w:rPr>
-        <w:t xml:space="preserve">Fuentes de datos</w:t>
-      </w:r>
-      <w:r>
-        <w:t xml:space="preserve"> </w:t>
-      </w:r>
-      <w:r>
-        <w:t xml:space="preserve">(versión exacta de cada descarga en</w:t>
-      </w:r>
-      <w:r>
-        <w:t xml:space="preserve"> </w:t>
-      </w:r>
-      <w:r>
-        <w:rPr>
-          <w:rStyle w:val="VerbatimChar"/>
-        </w:rPr>
-        <w:t xml:space="preserve">storage/raw/vintage_manifest.csv</w:t>
-      </w:r>
-      <w:r>
-        <w:t xml:space="preserve">):</w:t>
+        <w:t xml:space="preserve">6. Conclusiones</w:t>
       </w:r>
     </w:p>
     <w:p>
@@ -1575,20 +1689,7 @@
         </w:numPr>
       </w:pPr>
       <w:r>
-        <w:t xml:space="preserve">Banco de España.</w:t>
-      </w:r>
-      <w:r>
-        <w:t xml:space="preserve"> </w:t>
-      </w:r>
-      <w:r>
-        <w:rPr>
-          <w:i/>
-          <w:iCs/>
-        </w:rPr>
-        <w:t xml:space="preserve">Tipos de interés: Euríbor a 12 meses</w:t>
-      </w:r>
-      <w:r>
-        <w:t xml:space="preserve">. https://www.bde.es</w:t>
+        <w:t xml:space="preserve">Es posible construir, solo con fuentes públicas y código abierto, un sistema completo — datos → modelos → producto — sobre una pregunta de interés público, con estándares de trazabilidad de nivel profesional (vintage, tests de contrato, resultados negativos publicados).</w:t>
       </w:r>
     </w:p>
     <w:p>
@@ -1600,144 +1701,14 @@
         </w:numPr>
       </w:pPr>
       <w:r>
-        <w:t xml:space="preserve">Eurostat.</w:t>
-      </w:r>
-      <w:r>
-        <w:t xml:space="preserve"> </w:t>
-      </w:r>
-      <w:r>
-        <w:rPr>
-          <w:i/>
-          <w:iCs/>
-        </w:rPr>
-        <w:t xml:space="preserve">Government expenditure by function (COFOG)</w:t>
-      </w:r>
-      <w:r>
-        <w:t xml:space="preserve"> </w:t>
-      </w:r>
-      <w:r>
-        <w:t xml:space="preserve">(</w:t>
-      </w:r>
-      <w:r>
-        <w:rPr>
-          <w:rStyle w:val="VerbatimChar"/>
-        </w:rPr>
-        <w:t xml:space="preserve">gov_10a_exp</w:t>
-      </w:r>
-      <w:r>
-        <w:t xml:space="preserve">);</w:t>
-      </w:r>
-      <w:r>
-        <w:t xml:space="preserve"> </w:t>
-      </w:r>
-      <w:r>
-        <w:rPr>
-          <w:i/>
-          <w:iCs/>
-        </w:rPr>
-        <w:t xml:space="preserve">ESSPROS social protection expenditure</w:t>
-      </w:r>
-      <w:r>
-        <w:t xml:space="preserve"> </w:t>
-      </w:r>
-      <w:r>
-        <w:t xml:space="preserve">(</w:t>
-      </w:r>
-      <w:r>
-        <w:rPr>
-          <w:rStyle w:val="VerbatimChar"/>
-        </w:rPr>
-        <w:t xml:space="preserve">spr_exp_type</w:t>
-      </w:r>
-      <w:r>
-        <w:t xml:space="preserve">,</w:t>
-      </w:r>
-      <w:r>
-        <w:t xml:space="preserve"> </w:t>
-      </w:r>
-      <w:r>
-        <w:rPr>
-          <w:rStyle w:val="VerbatimChar"/>
-        </w:rPr>
-        <w:t xml:space="preserve">spr_exp_func</w:t>
-      </w:r>
-      <w:r>
-        <w:t xml:space="preserve">);</w:t>
-      </w:r>
-      <w:r>
-        <w:t xml:space="preserve"> </w:t>
-      </w:r>
-      <w:r>
-        <w:rPr>
-          <w:i/>
-          <w:iCs/>
-        </w:rPr>
-        <w:t xml:space="preserve">Population projections EUROPOP2023</w:t>
-      </w:r>
-      <w:r>
-        <w:t xml:space="preserve"> </w:t>
-      </w:r>
-      <w:r>
-        <w:t xml:space="preserve">(</w:t>
-      </w:r>
-      <w:r>
-        <w:rPr>
-          <w:rStyle w:val="VerbatimChar"/>
-        </w:rPr>
-        <w:t xml:space="preserve">proj_23n</w:t>
-      </w:r>
-      <w:r>
-        <w:t xml:space="preserve">);</w:t>
-      </w:r>
-      <w:r>
-        <w:t xml:space="preserve"> </w:t>
-      </w:r>
-      <w:r>
-        <w:rPr>
-          <w:i/>
-          <w:iCs/>
-        </w:rPr>
-        <w:t xml:space="preserve">GFCF by asset type</w:t>
-      </w:r>
-      <w:r>
-        <w:t xml:space="preserve"> </w:t>
-      </w:r>
-      <w:r>
-        <w:t xml:space="preserve">(</w:t>
-      </w:r>
-      <w:r>
-        <w:rPr>
-          <w:rStyle w:val="VerbatimChar"/>
-        </w:rPr>
-        <w:t xml:space="preserve">nama_10_an6</w:t>
-      </w:r>
-      <w:r>
-        <w:t xml:space="preserve">);</w:t>
-      </w:r>
-      <w:r>
-        <w:t xml:space="preserve"> </w:t>
-      </w:r>
-      <w:r>
-        <w:rPr>
-          <w:i/>
-          <w:iCs/>
-        </w:rPr>
-        <w:t xml:space="preserve">Building permits</w:t>
-      </w:r>
-      <w:r>
-        <w:t xml:space="preserve"> </w:t>
-      </w:r>
-      <w:r>
-        <w:t xml:space="preserve">(</w:t>
-      </w:r>
-      <w:r>
-        <w:rPr>
-          <w:rStyle w:val="VerbatimChar"/>
-        </w:rPr>
-        <w:t xml:space="preserve">sts_cobp_q</w:t>
-      </w:r>
-      <w:r>
-        <w:t xml:space="preserve">); series demográficas, SILC y de mortalidad evitable. https://ec.europa.eu/eurostat</w:t>
+        <w:rPr>
+          <w:b/>
+          <w:bCs/>
+        </w:rPr>
+        <w:t xml:space="preserve">La aportación diferencial es la disciplina</w:t>
+      </w:r>
+      <w:r>
+        <w:t xml:space="preserve">: pre-registro, test único, y la voluntad de dejar que las reglas maten a los modelos atractivos. Tres veces ganó lo simple; una vez el protocolo evitó una predicción de desplome en pleno boom. En un TFM, donde la tentación es exhibir el modelo más complejo, este trabajo defiende lo contrario con evidencia propia.</w:t>
       </w:r>
     </w:p>
     <w:p>
@@ -1749,265 +1720,17 @@
         </w:numPr>
       </w:pPr>
       <w:r>
-        <w:t xml:space="preserve">Fondo Monetario Internacional.</w:t>
-      </w:r>
-      <w:r>
-        <w:t xml:space="preserve"> </w:t>
-      </w:r>
-      <w:r>
-        <w:rPr>
-          <w:i/>
-          <w:iCs/>
-        </w:rPr>
-        <w:t xml:space="preserve">World Economic Outlook Database</w:t>
-      </w:r>
-      <w:r>
-        <w:t xml:space="preserve">. https://www.imf.org/en/Publications/WEO</w:t>
-      </w:r>
-    </w:p>
-    <w:p>
-      <w:pPr>
-        <w:pStyle w:val="Compact"/>
-        <w:numPr>
-          <w:ilvl w:val="0"/>
-          <w:numId w:val="1006"/>
-        </w:numPr>
-      </w:pPr>
-      <w:r>
-        <w:t xml:space="preserve">Instituto Nacional de Estadística.</w:t>
-      </w:r>
-      <w:r>
-        <w:t xml:space="preserve"> </w:t>
-      </w:r>
-      <w:r>
-        <w:rPr>
-          <w:i/>
-          <w:iCs/>
-        </w:rPr>
-        <w:t xml:space="preserve">Índice de Precios de Vivienda</w:t>
-      </w:r>
-      <w:r>
-        <w:t xml:space="preserve"> </w:t>
-      </w:r>
-      <w:r>
-        <w:t xml:space="preserve">(tablas 80270/80271);</w:t>
-      </w:r>
-      <w:r>
-        <w:t xml:space="preserve"> </w:t>
-      </w:r>
-      <w:r>
-        <w:rPr>
-          <w:i/>
-          <w:iCs/>
-        </w:rPr>
-        <w:t xml:space="preserve">IPC</w:t>
-      </w:r>
-      <w:r>
-        <w:t xml:space="preserve"> </w:t>
-      </w:r>
-      <w:r>
-        <w:t xml:space="preserve">(76136);</w:t>
-      </w:r>
-      <w:r>
-        <w:t xml:space="preserve"> </w:t>
-      </w:r>
-      <w:r>
-        <w:rPr>
-          <w:i/>
-          <w:iCs/>
-        </w:rPr>
-        <w:t xml:space="preserve">Encuesta Anual de Estructura Salarial</w:t>
-      </w:r>
-      <w:r>
-        <w:t xml:space="preserve"> </w:t>
-      </w:r>
-      <w:r>
-        <w:t xml:space="preserve">(28191). https://www.ine.es</w:t>
-      </w:r>
-    </w:p>
-    <w:p>
-      <w:pPr>
-        <w:pStyle w:val="Compact"/>
-        <w:numPr>
-          <w:ilvl w:val="0"/>
-          <w:numId w:val="1006"/>
-        </w:numPr>
-      </w:pPr>
-      <w:r>
-        <w:t xml:space="preserve">Jordà, Ò., Schularick, M. y Taylor, A. M. (2017).</w:t>
-      </w:r>
-      <w:r>
-        <w:t xml:space="preserve"> </w:t>
-      </w:r>
-      <w:r>
-        <w:t xml:space="preserve">“Macrofinancial History and the New Business Cycle Facts”</w:t>
-      </w:r>
-      <w:r>
-        <w:t xml:space="preserve">.</w:t>
-      </w:r>
-      <w:r>
-        <w:t xml:space="preserve"> </w:t>
-      </w:r>
-      <w:r>
-        <w:rPr>
-          <w:i/>
-          <w:iCs/>
-        </w:rPr>
-        <w:t xml:space="preserve">NBER Macroeconomics Annual</w:t>
-      </w:r>
-      <w:r>
-        <w:t xml:space="preserve">, 31(1). Datos: https://www.macrohistory.net</w:t>
-      </w:r>
-    </w:p>
-    <w:p>
-      <w:pPr>
-        <w:pStyle w:val="Compact"/>
-        <w:numPr>
-          <w:ilvl w:val="0"/>
-          <w:numId w:val="1006"/>
-        </w:numPr>
-      </w:pPr>
-      <w:r>
-        <w:t xml:space="preserve">Ministerio de Transportes y Movilidad Sostenible (MITMA).</w:t>
-      </w:r>
-      <w:r>
-        <w:t xml:space="preserve"> </w:t>
-      </w:r>
-      <w:r>
-        <w:rPr>
-          <w:i/>
-          <w:iCs/>
-        </w:rPr>
-        <w:t xml:space="preserve">Boletín Estadístico: precio del suelo urbano; índice de costes de la construcción</w:t>
-      </w:r>
-      <w:r>
-        <w:t xml:space="preserve">. https://apps.fomento.gob.es</w:t>
-      </w:r>
-    </w:p>
-    <w:p>
-      <w:pPr>
-        <w:pStyle w:val="Compact"/>
-        <w:numPr>
-          <w:ilvl w:val="0"/>
-          <w:numId w:val="1006"/>
-        </w:numPr>
-      </w:pPr>
-      <w:r>
-        <w:t xml:space="preserve">Müller, K., Xu, C., Lehbib, M. y Chen, Z. (2025).</w:t>
-      </w:r>
-      <w:r>
-        <w:t xml:space="preserve"> </w:t>
-      </w:r>
-      <w:r>
-        <w:rPr>
-          <w:i/>
-          <w:iCs/>
-        </w:rPr>
-        <w:t xml:space="preserve">The Global Macro Database</w:t>
-      </w:r>
-      <w:r>
-        <w:t xml:space="preserve">. https://www.globalmacrodata.com</w:t>
-      </w:r>
-    </w:p>
-    <w:p>
-      <w:pPr>
-        <w:pStyle w:val="Compact"/>
-        <w:numPr>
-          <w:ilvl w:val="0"/>
-          <w:numId w:val="1006"/>
-        </w:numPr>
-      </w:pPr>
-      <w:r>
-        <w:t xml:space="preserve">Naciones Unidas, DESA.</w:t>
-      </w:r>
-      <w:r>
-        <w:t xml:space="preserve"> </w:t>
-      </w:r>
-      <w:r>
-        <w:rPr>
-          <w:i/>
-          <w:iCs/>
-        </w:rPr>
-        <w:t xml:space="preserve">International Migrant Stock 2024</w:t>
-      </w:r>
-      <w:r>
-        <w:t xml:space="preserve">. https://www.un.org/development/desa/pd</w:t>
-      </w:r>
-    </w:p>
-    <w:p>
-      <w:pPr>
-        <w:pStyle w:val="Compact"/>
-        <w:numPr>
-          <w:ilvl w:val="0"/>
-          <w:numId w:val="1006"/>
-        </w:numPr>
-      </w:pPr>
-      <w:r>
-        <w:t xml:space="preserve">Organización Mundial de la Salud.</w:t>
-      </w:r>
-      <w:r>
-        <w:t xml:space="preserve"> </w:t>
-      </w:r>
-      <w:r>
-        <w:rPr>
-          <w:i/>
-          <w:iCs/>
-        </w:rPr>
-        <w:t xml:space="preserve">Global Health Expenditure Database (GHED)</w:t>
-      </w:r>
-      <w:r>
-        <w:t xml:space="preserve">;</w:t>
-      </w:r>
-      <w:r>
-        <w:t xml:space="preserve"> </w:t>
-      </w:r>
-      <w:r>
-        <w:rPr>
-          <w:i/>
-          <w:iCs/>
-        </w:rPr>
-        <w:t xml:space="preserve">Global Health Observatory (GHO)</w:t>
-      </w:r>
-      <w:r>
-        <w:t xml:space="preserve">. https://apps.who.int/nha ; https://www.who.int/data/gho</w:t>
-      </w:r>
-    </w:p>
-    <w:p>
-      <w:pPr>
-        <w:pStyle w:val="Compact"/>
-        <w:numPr>
-          <w:ilvl w:val="0"/>
-          <w:numId w:val="1006"/>
-        </w:numPr>
-      </w:pPr>
-      <w:r>
-        <w:t xml:space="preserve">World Bank.</w:t>
-      </w:r>
-      <w:r>
-        <w:t xml:space="preserve"> </w:t>
-      </w:r>
-      <w:r>
-        <w:rPr>
-          <w:i/>
-          <w:iCs/>
-        </w:rPr>
-        <w:t xml:space="preserve">World Development Indicators</w:t>
-      </w:r>
-      <w:r>
-        <w:t xml:space="preserve">;</w:t>
-      </w:r>
-      <w:r>
-        <w:t xml:space="preserve"> </w:t>
-      </w:r>
-      <w:r>
-        <w:rPr>
-          <w:i/>
-          <w:iCs/>
-        </w:rPr>
-        <w:t xml:space="preserve">Worldwide Bureaucracy Indicators (WWBI)</w:t>
-      </w:r>
-      <w:r>
-        <w:t xml:space="preserve">. https://data.worldbank.org</w:t>
+        <w:t xml:space="preserve">Sustantivamente: la asequibilidad española no se corrige sola (ni con salarios al 4 %); la palanca pública de vivienda es un orden de magnitud menor que la promoción privada; la renta domina el rendimiento sanitario entre países; y la demografía domina la senda de deuda por encima de cualquier palanca fiscal individual.</w:t>
+      </w:r>
+    </w:p>
+    <w:bookmarkEnd w:id="45"/>
+    <w:bookmarkStart w:id="46" w:name="trabajo-futuro"/>
+    <w:p>
+      <w:pPr>
+        <w:pStyle w:val="Heading2"/>
+      </w:pPr>
+      <w:r>
+        <w:t xml:space="preserve">7. Trabajo futuro</w:t>
       </w:r>
     </w:p>
     <w:p>
@@ -2015,11 +1738,47 @@
         <w:pStyle w:val="FirstParagraph"/>
       </w:pPr>
       <w:r>
-        <w:rPr>
-          <w:b/>
-          <w:bCs/>
-        </w:rPr>
-        <w:t xml:space="preserve">Métodos:</w:t>
+        <w:t xml:space="preserve">Pata provincial de visados (MITMA) y evaluación del driver de oferta con datos 2026+; cuota hipotecaria teórica con €/m²; panel quinquenal para A1 y módulos vivienda/educación; episodios históricos de consolidación (D2); actualización trimestral automática del pipeline; registro formal de modelos y versiones (hoy el versionado es git + artefactos gold, suficiente a esta escala pero explícitamente mínimo).</w:t>
+      </w:r>
+    </w:p>
+    <w:bookmarkEnd w:id="46"/>
+    <w:bookmarkStart w:id="47" w:name="referencias"/>
+    <w:p>
+      <w:pPr>
+        <w:pStyle w:val="Heading2"/>
+      </w:pPr>
+      <w:r>
+        <w:t xml:space="preserve">Referencias</w:t>
+      </w:r>
+    </w:p>
+    <w:p>
+      <w:pPr>
+        <w:pStyle w:val="FirstParagraph"/>
+      </w:pPr>
+      <w:r>
+        <w:rPr>
+          <w:b/>
+          <w:bCs/>
+        </w:rPr>
+        <w:t xml:space="preserve">Fuentes de datos</w:t>
+      </w:r>
+      <w:r>
+        <w:t xml:space="preserve"> </w:t>
+      </w:r>
+      <w:r>
+        <w:t xml:space="preserve">(versión exacta de cada descarga en</w:t>
+      </w:r>
+      <w:r>
+        <w:t xml:space="preserve"> </w:t>
+      </w:r>
+      <w:r>
+        <w:rPr>
+          <w:rStyle w:val="VerbatimChar"/>
+        </w:rPr>
+        <w:t xml:space="preserve">storage/raw/vintage_manifest.csv</w:t>
+      </w:r>
+      <w:r>
+        <w:t xml:space="preserve">):</w:t>
       </w:r>
     </w:p>
     <w:p>
@@ -2031,16 +1790,7 @@
         </w:numPr>
       </w:pPr>
       <w:r>
-        <w:t xml:space="preserve">Angelopoulos, A. N. y Bates, S. (2023).</w:t>
-      </w:r>
-      <w:r>
-        <w:t xml:space="preserve"> </w:t>
-      </w:r>
-      <w:r>
-        <w:t xml:space="preserve">“Conformal Prediction: A Gentle Introduction”</w:t>
-      </w:r>
-      <w:r>
-        <w:t xml:space="preserve">.</w:t>
+        <w:t xml:space="preserve">Banco de España.</w:t>
       </w:r>
       <w:r>
         <w:t xml:space="preserve"> </w:t>
@@ -2050,10 +1800,10 @@
           <w:i/>
           <w:iCs/>
         </w:rPr>
-        <w:t xml:space="preserve">Foundations and Trends in Machine Learning</w:t>
-      </w:r>
-      <w:r>
-        <w:t xml:space="preserve">, 16(4).</w:t>
+        <w:t xml:space="preserve">Tipos de interés: Euríbor a 12 meses</w:t>
+      </w:r>
+      <w:r>
+        <w:t xml:space="preserve">. https://www.bde.es</w:t>
       </w:r>
     </w:p>
     <w:p>
@@ -2065,16 +1815,7 @@
         </w:numPr>
       </w:pPr>
       <w:r>
-        <w:t xml:space="preserve">Blanchard, O. (2019).</w:t>
-      </w:r>
-      <w:r>
-        <w:t xml:space="preserve"> </w:t>
-      </w:r>
-      <w:r>
-        <w:t xml:space="preserve">“Public Debt and Low Interest Rates”</w:t>
-      </w:r>
-      <w:r>
-        <w:t xml:space="preserve">.</w:t>
+        <w:t xml:space="preserve">Eurostat.</w:t>
       </w:r>
       <w:r>
         <w:t xml:space="preserve"> </w:t>
@@ -2084,10 +1825,134 @@
           <w:i/>
           <w:iCs/>
         </w:rPr>
-        <w:t xml:space="preserve">American Economic Review</w:t>
-      </w:r>
-      <w:r>
-        <w:t xml:space="preserve">, 109(4).</w:t>
+        <w:t xml:space="preserve">Government expenditure by function (COFOG)</w:t>
+      </w:r>
+      <w:r>
+        <w:t xml:space="preserve"> </w:t>
+      </w:r>
+      <w:r>
+        <w:t xml:space="preserve">(</w:t>
+      </w:r>
+      <w:r>
+        <w:rPr>
+          <w:rStyle w:val="VerbatimChar"/>
+        </w:rPr>
+        <w:t xml:space="preserve">gov_10a_exp</w:t>
+      </w:r>
+      <w:r>
+        <w:t xml:space="preserve">);</w:t>
+      </w:r>
+      <w:r>
+        <w:t xml:space="preserve"> </w:t>
+      </w:r>
+      <w:r>
+        <w:rPr>
+          <w:i/>
+          <w:iCs/>
+        </w:rPr>
+        <w:t xml:space="preserve">ESSPROS social protection expenditure</w:t>
+      </w:r>
+      <w:r>
+        <w:t xml:space="preserve"> </w:t>
+      </w:r>
+      <w:r>
+        <w:t xml:space="preserve">(</w:t>
+      </w:r>
+      <w:r>
+        <w:rPr>
+          <w:rStyle w:val="VerbatimChar"/>
+        </w:rPr>
+        <w:t xml:space="preserve">spr_exp_type</w:t>
+      </w:r>
+      <w:r>
+        <w:t xml:space="preserve">,</w:t>
+      </w:r>
+      <w:r>
+        <w:t xml:space="preserve"> </w:t>
+      </w:r>
+      <w:r>
+        <w:rPr>
+          <w:rStyle w:val="VerbatimChar"/>
+        </w:rPr>
+        <w:t xml:space="preserve">spr_exp_func</w:t>
+      </w:r>
+      <w:r>
+        <w:t xml:space="preserve">);</w:t>
+      </w:r>
+      <w:r>
+        <w:t xml:space="preserve"> </w:t>
+      </w:r>
+      <w:r>
+        <w:rPr>
+          <w:i/>
+          <w:iCs/>
+        </w:rPr>
+        <w:t xml:space="preserve">Population projections EUROPOP2023</w:t>
+      </w:r>
+      <w:r>
+        <w:t xml:space="preserve"> </w:t>
+      </w:r>
+      <w:r>
+        <w:t xml:space="preserve">(</w:t>
+      </w:r>
+      <w:r>
+        <w:rPr>
+          <w:rStyle w:val="VerbatimChar"/>
+        </w:rPr>
+        <w:t xml:space="preserve">proj_23n</w:t>
+      </w:r>
+      <w:r>
+        <w:t xml:space="preserve">);</w:t>
+      </w:r>
+      <w:r>
+        <w:t xml:space="preserve"> </w:t>
+      </w:r>
+      <w:r>
+        <w:rPr>
+          <w:i/>
+          <w:iCs/>
+        </w:rPr>
+        <w:t xml:space="preserve">GFCF by asset type</w:t>
+      </w:r>
+      <w:r>
+        <w:t xml:space="preserve"> </w:t>
+      </w:r>
+      <w:r>
+        <w:t xml:space="preserve">(</w:t>
+      </w:r>
+      <w:r>
+        <w:rPr>
+          <w:rStyle w:val="VerbatimChar"/>
+        </w:rPr>
+        <w:t xml:space="preserve">nama_10_an6</w:t>
+      </w:r>
+      <w:r>
+        <w:t xml:space="preserve">);</w:t>
+      </w:r>
+      <w:r>
+        <w:t xml:space="preserve"> </w:t>
+      </w:r>
+      <w:r>
+        <w:rPr>
+          <w:i/>
+          <w:iCs/>
+        </w:rPr>
+        <w:t xml:space="preserve">Building permits</w:t>
+      </w:r>
+      <w:r>
+        <w:t xml:space="preserve"> </w:t>
+      </w:r>
+      <w:r>
+        <w:t xml:space="preserve">(</w:t>
+      </w:r>
+      <w:r>
+        <w:rPr>
+          <w:rStyle w:val="VerbatimChar"/>
+        </w:rPr>
+        <w:t xml:space="preserve">sts_cobp_q</w:t>
+      </w:r>
+      <w:r>
+        <w:t xml:space="preserve">); series demográficas, SILC y de mortalidad evitable. https://ec.europa.eu/eurostat</w:t>
       </w:r>
     </w:p>
     <w:p>
@@ -2099,7 +1964,7 @@
         </w:numPr>
       </w:pPr>
       <w:r>
-        <w:t xml:space="preserve">Hyndman, R. J. y Athanasopoulos, G. (2021).</w:t>
+        <w:t xml:space="preserve">Fondo Monetario Internacional.</w:t>
       </w:r>
       <w:r>
         <w:t xml:space="preserve"> </w:t>
@@ -2109,13 +1974,10 @@
           <w:i/>
           <w:iCs/>
         </w:rPr>
-        <w:t xml:space="preserve">Forecasting: Principles and Practice</w:t>
-      </w:r>
-      <w:r>
-        <w:t xml:space="preserve"> </w:t>
-      </w:r>
-      <w:r>
-        <w:t xml:space="preserve">(3ª ed.). OTexts. https://otexts.com/fpp3</w:t>
+        <w:t xml:space="preserve">World Economic Outlook Database</w:t>
+      </w:r>
+      <w:r>
+        <w:t xml:space="preserve">. https://www.imf.org/en/Publications/WEO</w:t>
       </w:r>
     </w:p>
     <w:p>
@@ -2127,16 +1989,7 @@
         </w:numPr>
       </w:pPr>
       <w:r>
-        <w:t xml:space="preserve">Hyndman, R. J. y Koehler, A. B. (2006).</w:t>
-      </w:r>
-      <w:r>
-        <w:t xml:space="preserve"> </w:t>
-      </w:r>
-      <w:r>
-        <w:t xml:space="preserve">“Another look at measures of forecast accuracy”</w:t>
-      </w:r>
-      <w:r>
-        <w:t xml:space="preserve">.</w:t>
+        <w:t xml:space="preserve">Instituto Nacional de Estadística.</w:t>
       </w:r>
       <w:r>
         <w:t xml:space="preserve"> </w:t>
@@ -2146,10 +1999,45 @@
           <w:i/>
           <w:iCs/>
         </w:rPr>
-        <w:t xml:space="preserve">International Journal of Forecasting</w:t>
-      </w:r>
-      <w:r>
-        <w:t xml:space="preserve">, 22(4).</w:t>
+        <w:t xml:space="preserve">Índice de Precios de Vivienda</w:t>
+      </w:r>
+      <w:r>
+        <w:t xml:space="preserve"> </w:t>
+      </w:r>
+      <w:r>
+        <w:t xml:space="preserve">(tablas 80270/80271);</w:t>
+      </w:r>
+      <w:r>
+        <w:t xml:space="preserve"> </w:t>
+      </w:r>
+      <w:r>
+        <w:rPr>
+          <w:i/>
+          <w:iCs/>
+        </w:rPr>
+        <w:t xml:space="preserve">IPC</w:t>
+      </w:r>
+      <w:r>
+        <w:t xml:space="preserve"> </w:t>
+      </w:r>
+      <w:r>
+        <w:t xml:space="preserve">(76136);</w:t>
+      </w:r>
+      <w:r>
+        <w:t xml:space="preserve"> </w:t>
+      </w:r>
+      <w:r>
+        <w:rPr>
+          <w:i/>
+          <w:iCs/>
+        </w:rPr>
+        <w:t xml:space="preserve">Encuesta Anual de Estructura Salarial</w:t>
+      </w:r>
+      <w:r>
+        <w:t xml:space="preserve"> </w:t>
+      </w:r>
+      <w:r>
+        <w:t xml:space="preserve">(28191). https://www.ine.es</w:t>
       </w:r>
     </w:p>
     <w:p>
@@ -2161,13 +2049,13 @@
         </w:numPr>
       </w:pPr>
       <w:r>
-        <w:t xml:space="preserve">Ke, G. et al. (2017).</w:t>
-      </w:r>
-      <w:r>
-        <w:t xml:space="preserve"> </w:t>
-      </w:r>
-      <w:r>
-        <w:t xml:space="preserve">“LightGBM: A Highly Efficient Gradient Boosting Decision Tree”</w:t>
+        <w:t xml:space="preserve">Jordà, Ò., Schularick, M. y Taylor, A. M. (2017).</w:t>
+      </w:r>
+      <w:r>
+        <w:t xml:space="preserve"> </w:t>
+      </w:r>
+      <w:r>
+        <w:t xml:space="preserve">“Macrofinancial History and the New Business Cycle Facts”</w:t>
       </w:r>
       <w:r>
         <w:t xml:space="preserve">.</w:t>
@@ -2180,10 +2068,10 @@
           <w:i/>
           <w:iCs/>
         </w:rPr>
-        <w:t xml:space="preserve">NeurIPS 30</w:t>
-      </w:r>
-      <w:r>
-        <w:t xml:space="preserve">.</w:t>
+        <w:t xml:space="preserve">NBER Macroeconomics Annual</w:t>
+      </w:r>
+      <w:r>
+        <w:t xml:space="preserve">, 31(1). Datos: https://www.macrohistory.net</w:t>
       </w:r>
     </w:p>
     <w:p>
@@ -2195,16 +2083,7 @@
         </w:numPr>
       </w:pPr>
       <w:r>
-        <w:t xml:space="preserve">Lundberg, S. M. y Lee, S.-I. (2017).</w:t>
-      </w:r>
-      <w:r>
-        <w:t xml:space="preserve"> </w:t>
-      </w:r>
-      <w:r>
-        <w:t xml:space="preserve">“A Unified Approach to Interpreting Model Predictions”</w:t>
-      </w:r>
-      <w:r>
-        <w:t xml:space="preserve">.</w:t>
+        <w:t xml:space="preserve">Ministerio de Transportes y Movilidad Sostenible (MITMA).</w:t>
       </w:r>
       <w:r>
         <w:t xml:space="preserve"> </w:t>
@@ -2214,10 +2093,10 @@
           <w:i/>
           <w:iCs/>
         </w:rPr>
-        <w:t xml:space="preserve">NeurIPS 30</w:t>
-      </w:r>
-      <w:r>
-        <w:t xml:space="preserve">.</w:t>
+        <w:t xml:space="preserve">Boletín Estadístico: precio del suelo urbano; índice de costes de la construcción</w:t>
+      </w:r>
+      <w:r>
+        <w:t xml:space="preserve">. https://apps.fomento.gob.es</w:t>
       </w:r>
     </w:p>
     <w:p>
@@ -2229,7 +2108,7 @@
         </w:numPr>
       </w:pPr>
       <w:r>
-        <w:t xml:space="preserve">Tanzi, V. y Schuknecht, L. (2000).</w:t>
+        <w:t xml:space="preserve">Müller, K., Xu, C., Lehbib, M. y Chen, Z. (2025).</w:t>
       </w:r>
       <w:r>
         <w:t xml:space="preserve"> </w:t>
@@ -2239,14 +2118,350 @@
           <w:i/>
           <w:iCs/>
         </w:rPr>
+        <w:t xml:space="preserve">The Global Macro Database</w:t>
+      </w:r>
+      <w:r>
+        <w:t xml:space="preserve">. https://www.globalmacrodata.com</w:t>
+      </w:r>
+    </w:p>
+    <w:p>
+      <w:pPr>
+        <w:pStyle w:val="Compact"/>
+        <w:numPr>
+          <w:ilvl w:val="0"/>
+          <w:numId w:val="1007"/>
+        </w:numPr>
+      </w:pPr>
+      <w:r>
+        <w:t xml:space="preserve">Naciones Unidas, DESA.</w:t>
+      </w:r>
+      <w:r>
+        <w:t xml:space="preserve"> </w:t>
+      </w:r>
+      <w:r>
+        <w:rPr>
+          <w:i/>
+          <w:iCs/>
+        </w:rPr>
+        <w:t xml:space="preserve">International Migrant Stock 2024</w:t>
+      </w:r>
+      <w:r>
+        <w:t xml:space="preserve">. https://www.un.org/development/desa/pd</w:t>
+      </w:r>
+    </w:p>
+    <w:p>
+      <w:pPr>
+        <w:pStyle w:val="Compact"/>
+        <w:numPr>
+          <w:ilvl w:val="0"/>
+          <w:numId w:val="1007"/>
+        </w:numPr>
+      </w:pPr>
+      <w:r>
+        <w:t xml:space="preserve">Organización Mundial de la Salud.</w:t>
+      </w:r>
+      <w:r>
+        <w:t xml:space="preserve"> </w:t>
+      </w:r>
+      <w:r>
+        <w:rPr>
+          <w:i/>
+          <w:iCs/>
+        </w:rPr>
+        <w:t xml:space="preserve">Global Health Expenditure Database (GHED)</w:t>
+      </w:r>
+      <w:r>
+        <w:t xml:space="preserve">;</w:t>
+      </w:r>
+      <w:r>
+        <w:t xml:space="preserve"> </w:t>
+      </w:r>
+      <w:r>
+        <w:rPr>
+          <w:i/>
+          <w:iCs/>
+        </w:rPr>
+        <w:t xml:space="preserve">Global Health Observatory (GHO)</w:t>
+      </w:r>
+      <w:r>
+        <w:t xml:space="preserve">. https://apps.who.int/nha ; https://www.who.int/data/gho</w:t>
+      </w:r>
+    </w:p>
+    <w:p>
+      <w:pPr>
+        <w:pStyle w:val="Compact"/>
+        <w:numPr>
+          <w:ilvl w:val="0"/>
+          <w:numId w:val="1007"/>
+        </w:numPr>
+      </w:pPr>
+      <w:r>
+        <w:t xml:space="preserve">World Bank.</w:t>
+      </w:r>
+      <w:r>
+        <w:t xml:space="preserve"> </w:t>
+      </w:r>
+      <w:r>
+        <w:rPr>
+          <w:i/>
+          <w:iCs/>
+        </w:rPr>
+        <w:t xml:space="preserve">World Development Indicators</w:t>
+      </w:r>
+      <w:r>
+        <w:t xml:space="preserve">;</w:t>
+      </w:r>
+      <w:r>
+        <w:t xml:space="preserve"> </w:t>
+      </w:r>
+      <w:r>
+        <w:rPr>
+          <w:i/>
+          <w:iCs/>
+        </w:rPr>
+        <w:t xml:space="preserve">Worldwide Bureaucracy Indicators (WWBI)</w:t>
+      </w:r>
+      <w:r>
+        <w:t xml:space="preserve">. https://data.worldbank.org</w:t>
+      </w:r>
+    </w:p>
+    <w:p>
+      <w:pPr>
+        <w:pStyle w:val="FirstParagraph"/>
+      </w:pPr>
+      <w:r>
+        <w:rPr>
+          <w:b/>
+          <w:bCs/>
+        </w:rPr>
+        <w:t xml:space="preserve">Métodos:</w:t>
+      </w:r>
+    </w:p>
+    <w:p>
+      <w:pPr>
+        <w:pStyle w:val="Compact"/>
+        <w:numPr>
+          <w:ilvl w:val="0"/>
+          <w:numId w:val="1008"/>
+        </w:numPr>
+      </w:pPr>
+      <w:r>
+        <w:t xml:space="preserve">Angelopoulos, A. N. y Bates, S. (2023).</w:t>
+      </w:r>
+      <w:r>
+        <w:t xml:space="preserve"> </w:t>
+      </w:r>
+      <w:r>
+        <w:t xml:space="preserve">“Conformal Prediction: A Gentle Introduction”</w:t>
+      </w:r>
+      <w:r>
+        <w:t xml:space="preserve">.</w:t>
+      </w:r>
+      <w:r>
+        <w:t xml:space="preserve"> </w:t>
+      </w:r>
+      <w:r>
+        <w:rPr>
+          <w:i/>
+          <w:iCs/>
+        </w:rPr>
+        <w:t xml:space="preserve">Foundations and Trends in Machine Learning</w:t>
+      </w:r>
+      <w:r>
+        <w:t xml:space="preserve">, 16(4).</w:t>
+      </w:r>
+    </w:p>
+    <w:p>
+      <w:pPr>
+        <w:pStyle w:val="Compact"/>
+        <w:numPr>
+          <w:ilvl w:val="0"/>
+          <w:numId w:val="1008"/>
+        </w:numPr>
+      </w:pPr>
+      <w:r>
+        <w:t xml:space="preserve">Blanchard, O. (2019).</w:t>
+      </w:r>
+      <w:r>
+        <w:t xml:space="preserve"> </w:t>
+      </w:r>
+      <w:r>
+        <w:t xml:space="preserve">“Public Debt and Low Interest Rates”</w:t>
+      </w:r>
+      <w:r>
+        <w:t xml:space="preserve">.</w:t>
+      </w:r>
+      <w:r>
+        <w:t xml:space="preserve"> </w:t>
+      </w:r>
+      <w:r>
+        <w:rPr>
+          <w:i/>
+          <w:iCs/>
+        </w:rPr>
+        <w:t xml:space="preserve">American Economic Review</w:t>
+      </w:r>
+      <w:r>
+        <w:t xml:space="preserve">, 109(4).</w:t>
+      </w:r>
+    </w:p>
+    <w:p>
+      <w:pPr>
+        <w:pStyle w:val="Compact"/>
+        <w:numPr>
+          <w:ilvl w:val="0"/>
+          <w:numId w:val="1008"/>
+        </w:numPr>
+      </w:pPr>
+      <w:r>
+        <w:t xml:space="preserve">Hyndman, R. J. y Athanasopoulos, G. (2021).</w:t>
+      </w:r>
+      <w:r>
+        <w:t xml:space="preserve"> </w:t>
+      </w:r>
+      <w:r>
+        <w:rPr>
+          <w:i/>
+          <w:iCs/>
+        </w:rPr>
+        <w:t xml:space="preserve">Forecasting: Principles and Practice</w:t>
+      </w:r>
+      <w:r>
+        <w:t xml:space="preserve"> </w:t>
+      </w:r>
+      <w:r>
+        <w:t xml:space="preserve">(3ª ed.). OTexts. https://otexts.com/fpp3</w:t>
+      </w:r>
+    </w:p>
+    <w:p>
+      <w:pPr>
+        <w:pStyle w:val="Compact"/>
+        <w:numPr>
+          <w:ilvl w:val="0"/>
+          <w:numId w:val="1008"/>
+        </w:numPr>
+      </w:pPr>
+      <w:r>
+        <w:t xml:space="preserve">Hyndman, R. J. y Koehler, A. B. (2006).</w:t>
+      </w:r>
+      <w:r>
+        <w:t xml:space="preserve"> </w:t>
+      </w:r>
+      <w:r>
+        <w:t xml:space="preserve">“Another look at measures of forecast accuracy”</w:t>
+      </w:r>
+      <w:r>
+        <w:t xml:space="preserve">.</w:t>
+      </w:r>
+      <w:r>
+        <w:t xml:space="preserve"> </w:t>
+      </w:r>
+      <w:r>
+        <w:rPr>
+          <w:i/>
+          <w:iCs/>
+        </w:rPr>
+        <w:t xml:space="preserve">International Journal of Forecasting</w:t>
+      </w:r>
+      <w:r>
+        <w:t xml:space="preserve">, 22(4).</w:t>
+      </w:r>
+    </w:p>
+    <w:p>
+      <w:pPr>
+        <w:pStyle w:val="Compact"/>
+        <w:numPr>
+          <w:ilvl w:val="0"/>
+          <w:numId w:val="1008"/>
+        </w:numPr>
+      </w:pPr>
+      <w:r>
+        <w:t xml:space="preserve">Ke, G. et al. (2017).</w:t>
+      </w:r>
+      <w:r>
+        <w:t xml:space="preserve"> </w:t>
+      </w:r>
+      <w:r>
+        <w:t xml:space="preserve">“LightGBM: A Highly Efficient Gradient Boosting Decision Tree”</w:t>
+      </w:r>
+      <w:r>
+        <w:t xml:space="preserve">.</w:t>
+      </w:r>
+      <w:r>
+        <w:t xml:space="preserve"> </w:t>
+      </w:r>
+      <w:r>
+        <w:rPr>
+          <w:i/>
+          <w:iCs/>
+        </w:rPr>
+        <w:t xml:space="preserve">NeurIPS 30</w:t>
+      </w:r>
+      <w:r>
+        <w:t xml:space="preserve">.</w:t>
+      </w:r>
+    </w:p>
+    <w:p>
+      <w:pPr>
+        <w:pStyle w:val="Compact"/>
+        <w:numPr>
+          <w:ilvl w:val="0"/>
+          <w:numId w:val="1008"/>
+        </w:numPr>
+      </w:pPr>
+      <w:r>
+        <w:t xml:space="preserve">Lundberg, S. M. y Lee, S.-I. (2017).</w:t>
+      </w:r>
+      <w:r>
+        <w:t xml:space="preserve"> </w:t>
+      </w:r>
+      <w:r>
+        <w:t xml:space="preserve">“A Unified Approach to Interpreting Model Predictions”</w:t>
+      </w:r>
+      <w:r>
+        <w:t xml:space="preserve">.</w:t>
+      </w:r>
+      <w:r>
+        <w:t xml:space="preserve"> </w:t>
+      </w:r>
+      <w:r>
+        <w:rPr>
+          <w:i/>
+          <w:iCs/>
+        </w:rPr>
+        <w:t xml:space="preserve">NeurIPS 30</w:t>
+      </w:r>
+      <w:r>
+        <w:t xml:space="preserve">.</w:t>
+      </w:r>
+    </w:p>
+    <w:p>
+      <w:pPr>
+        <w:pStyle w:val="Compact"/>
+        <w:numPr>
+          <w:ilvl w:val="0"/>
+          <w:numId w:val="1008"/>
+        </w:numPr>
+      </w:pPr>
+      <w:r>
+        <w:t xml:space="preserve">Tanzi, V. y Schuknecht, L. (2000).</w:t>
+      </w:r>
+      <w:r>
+        <w:t xml:space="preserve"> </w:t>
+      </w:r>
+      <w:r>
+        <w:rPr>
+          <w:i/>
+          <w:iCs/>
+        </w:rPr>
         <w:t xml:space="preserve">Public Spending in the 20th Century: A Global Perspective</w:t>
       </w:r>
       <w:r>
         <w:t xml:space="preserve">. Cambridge University Press.</w:t>
       </w:r>
     </w:p>
-    <w:bookmarkEnd w:id="46"/>
-    <w:bookmarkStart w:id="47" w:name="anexo-guía-de-reproducción"/>
+    <w:bookmarkEnd w:id="47"/>
+    <w:bookmarkStart w:id="48" w:name="anexo-guía-de-reproducción"/>
     <w:p>
       <w:pPr>
         <w:pStyle w:val="Heading2"/>
@@ -2493,8 +2708,8 @@
         <w:t xml:space="preserve">.</w:t>
       </w:r>
     </w:p>
-    <w:bookmarkEnd w:id="47"/>
     <w:bookmarkEnd w:id="48"/>
+    <w:bookmarkEnd w:id="49"/>
     <w:sectPr>
       <w:footnotePr>
         <w:numRestart w:val="eachSect"/>
@@ -2893,9 +3108,39 @@
     </w:lvlOverride>
   </w:num>
   <w:num w:numId="1006">
+    <w:abstractNumId w:val="99411"/>
+    <w:lvlOverride w:ilvl="0">
+      <w:startOverride w:val="1"/>
+    </w:lvlOverride>
+    <w:lvlOverride w:ilvl="1">
+      <w:startOverride w:val="1"/>
+    </w:lvlOverride>
+    <w:lvlOverride w:ilvl="2">
+      <w:startOverride w:val="1"/>
+    </w:lvlOverride>
+    <w:lvlOverride w:ilvl="3">
+      <w:startOverride w:val="1"/>
+    </w:lvlOverride>
+    <w:lvlOverride w:ilvl="4">
+      <w:startOverride w:val="1"/>
+    </w:lvlOverride>
+    <w:lvlOverride w:ilvl="5">
+      <w:startOverride w:val="1"/>
+    </w:lvlOverride>
+    <w:lvlOverride w:ilvl="6">
+      <w:startOverride w:val="1"/>
+    </w:lvlOverride>
+    <w:lvlOverride w:ilvl="7">
+      <w:startOverride w:val="1"/>
+    </w:lvlOverride>
+    <w:lvlOverride w:ilvl="8">
+      <w:startOverride w:val="1"/>
+    </w:lvlOverride>
+  </w:num>
+  <w:num w:numId="1007">
     <w:abstractNumId w:val="991"/>
   </w:num>
-  <w:num w:numId="1007">
+  <w:num w:numId="1008">
     <w:abstractNumId w:val="991"/>
   </w:num>
 </w:numbering>

</xml_diff>

<commit_message>
Regenerados MEMORIA.docx/pdf con todas las secciones nuevas + conteo gold en README
Verificado: los exportes contienen horizonte 50, panel within, triangulo
fiscal, empalme historico y URL de la demo (antes: vintage pre-expansion)

Co-Authored-By: Claude Fable 5 <noreply@anthropic.com>
</commit_message>
<xml_diff>
--- a/docs/MEMORIA.docx
+++ b/docs/MEMORIA.docx
@@ -2,7 +2,7 @@
 <file path=word/document.xml><?xml version="1.0" encoding="utf-8"?>
 <w:document xmlns:w="http://schemas.openxmlformats.org/wordprocessingml/2006/main" xmlns:m="http://schemas.openxmlformats.org/officeDocument/2006/math" xmlns:r="http://schemas.openxmlformats.org/officeDocument/2006/relationships" xmlns:o="urn:schemas-microsoft-com:office:office" xmlns:v="urn:schemas-microsoft-com:vml" xmlns:w10="urn:schemas-microsoft-com:office:word" xmlns:a="http://schemas.openxmlformats.org/drawingml/2006/main" xmlns:pic="http://schemas.openxmlformats.org/drawingml/2006/picture" xmlns:wp="http://schemas.openxmlformats.org/drawingml/2006/wordprocessingDrawing">
   <w:body>
-    <w:bookmarkStart w:id="49" w:name="dinero-público-resultados"/>
+    <w:bookmarkStart w:id="58" w:name="dinero-público-resultados"/>
     <w:p>
       <w:pPr>
         <w:pStyle w:val="Heading1"/>
@@ -81,29 +81,29 @@
           <w:b/>
           <w:bCs/>
         </w:rPr>
-        <w:t xml:space="preserve">¿qué obtiene un país (y una comunidad autónoma) a cambio de su gasto público?</w:t>
-      </w:r>
-      <w:r>
-        <w:t xml:space="preserve"> </w:t>
-      </w:r>
-      <w:r>
-        <w:t xml:space="preserve">El sistema comprende: un pipeline reproducible de extracción por capas sobre más de 30 fuentes públicas (INE, Eurostat, FMI, OMS, Banco Mundial, GMD/JST); un</w:t>
-      </w:r>
-      <w:r>
-        <w:t xml:space="preserve"> </w:t>
-      </w:r>
-      <w:r>
-        <w:rPr>
-          <w:b/>
-          <w:bCs/>
-        </w:rPr>
-        <w:t xml:space="preserve">atlas de la evolución del gasto público en los siglos XX–XXI</w:t>
-      </w:r>
-      <w:r>
-        <w:t xml:space="preserve"> </w:t>
-      </w:r>
-      <w:r>
-        <w:t xml:space="preserve">(16 figuras); un</w:t>
+        <w:t xml:space="preserve">¿qué obtiene un país (y una comunidad autónoma) a cambio de su dinero público?</w:t>
+      </w:r>
+      <w:r>
+        <w:t xml:space="preserve"> </w:t>
+      </w:r>
+      <w:r>
+        <w:t xml:space="preserve">El sistema comprende: un pipeline reproducible de extracción por capas sobre más de 40 fuentes públicas (INE, Eurostat, FMI, OMS, Banco Mundial, BIS, OCDE, GMD/JST); un</w:t>
+      </w:r>
+      <w:r>
+        <w:t xml:space="preserve"> </w:t>
+      </w:r>
+      <w:r>
+        <w:rPr>
+          <w:b/>
+          <w:bCs/>
+        </w:rPr>
+        <w:t xml:space="preserve">atlas de la evolución del gasto público</w:t>
+      </w:r>
+      <w:r>
+        <w:t xml:space="preserve"> </w:t>
+      </w:r>
+      <w:r>
+        <w:t xml:space="preserve">(figuras B1–B19, con series empalmadas 1703–2025 y su trampa de perímetro medida); un</w:t>
       </w:r>
       <w:r>
         <w:t xml:space="preserve"> </w:t>
@@ -119,23 +119,39 @@
         <w:t xml:space="preserve"> </w:t>
       </w:r>
       <w:r>
-        <w:t xml:space="preserve">seleccionado mediante un protocolo pre-registrado con test final de un solo uso; un</w:t>
-      </w:r>
-      <w:r>
-        <w:t xml:space="preserve"> </w:t>
-      </w:r>
-      <w:r>
-        <w:rPr>
-          <w:b/>
-          <w:bCs/>
-        </w:rPr>
-        <w:t xml:space="preserve">análisis de rendimiento ajustado del gasto sanitario</w:t>
-      </w:r>
-      <w:r>
-        <w:t xml:space="preserve"> </w:t>
-      </w:r>
-      <w:r>
-        <w:t xml:space="preserve">en 164 países con incertidumbre conformal; un</w:t>
+        <w:t xml:space="preserve">seleccionado mediante un protocolo pre-registrado con test final de un solo uso; el</w:t>
+      </w:r>
+      <w:r>
+        <w:t xml:space="preserve"> </w:t>
+      </w:r>
+      <w:r>
+        <w:rPr>
+          <w:b/>
+          <w:bCs/>
+        </w:rPr>
+        <w:t xml:space="preserve">triángulo fiscal completo</w:t>
+      </w:r>
+      <w:r>
+        <w:t xml:space="preserve"> </w:t>
+      </w:r>
+      <w:r>
+        <w:t xml:space="preserve">— gasto por función (COFOG, 89 países), ingresos por tipo (WoRLD, 195) y resultados objetivos de bienestar (marco MPI/MODA de pobreza y pobreza infantil, 13 series) — reconciliado entre fuentes independientes (15/15 checks);</w:t>
+      </w:r>
+      <w:r>
+        <w:t xml:space="preserve"> </w:t>
+      </w:r>
+      <w:r>
+        <w:rPr>
+          <w:b/>
+          <w:bCs/>
+        </w:rPr>
+        <w:t xml:space="preserve">fronteras de rendimiento ajustado</w:t>
+      </w:r>
+      <w:r>
+        <w:t xml:space="preserve"> </w:t>
+      </w:r>
+      <w:r>
+        <w:t xml:space="preserve">en tres dominios (sanidad, educación, bienestar/mortalidad infantil) con incertidumbre conformal; un</w:t>
       </w:r>
       <w:r>
         <w:t xml:space="preserve"> </w:t>
@@ -167,7 +183,7 @@
         <w:t xml:space="preserve"> </w:t>
       </w:r>
       <w:r>
-        <w:t xml:space="preserve">(API + dashboard) que sirve todos los resultados con su incertidumbre siempre visible.</w:t>
+        <w:t xml:space="preserve">(API + dashboard + asistente RAG) que sirve todos los resultados con su incertidumbre siempre visible.</w:t>
       </w:r>
     </w:p>
     <w:p>
@@ -175,23 +191,23 @@
         <w:pStyle w:val="BodyText"/>
       </w:pPr>
       <w:r>
-        <w:t xml:space="preserve">El resultado metodológico central no es un modelo, sino una disciplina: todos los criterios de aceptación se fijaron ANTES de comparar modelos, y en las tres ocasiones en que un modelo flexible (SARIMAX, LightGBM) compitió contra una alternativa simple bajo esas reglas,</w:t>
-      </w:r>
-      <w:r>
-        <w:t xml:space="preserve"> </w:t>
-      </w:r>
-      <w:r>
-        <w:rPr>
-          <w:b/>
-          <w:bCs/>
-        </w:rPr>
-        <w:t xml:space="preserve">perdió</w:t>
-      </w:r>
-      <w:r>
-        <w:t xml:space="preserve"> </w:t>
-      </w:r>
-      <w:r>
-        <w:t xml:space="preserve">— incluido un caso en el que el test final refutó una hipótesis prometedora en validación y evitó publicar una predicción de desplome del precio de la vivienda en pleno boom. Los resultados negativos se publican como tales.</w:t>
+        <w:t xml:space="preserve">El resultado metodológico central no es un modelo, sino una disciplina: todos los criterios de aceptación se fijaron ANTES de comparar modelos, y en los cinco contests de pronóstico (SARIMAX, LightGBM, LightGBM+demanda, modelo fundacional Chronos y DL global entrenado en 1.760 series extranjeras) el campeón simple</w:t>
+      </w:r>
+      <w:r>
+        <w:t xml:space="preserve"> </w:t>
+      </w:r>
+      <w:r>
+        <w:rPr>
+          <w:b/>
+          <w:bCs/>
+        </w:rPr>
+        <w:t xml:space="preserve">no fue batido</w:t>
+      </w:r>
+      <w:r>
+        <w:t xml:space="preserve"> </w:t>
+      </w:r>
+      <w:r>
+        <w:t xml:space="preserve">— el mejor candidato llegó al empate técnico (0,401 vs 0,395 de MASE) y no se adoptó porque la regla exige más; el test final refutó además una hipótesis prometedora en validación y evitó publicar una predicción de desplome del precio de la vivienda en pleno boom. En las fronteras transversales, el OLS ganó las cinco veces al flexible. Los resultados negativos se publican como tales.</w:t>
       </w:r>
     </w:p>
     <w:bookmarkEnd w:id="11"/>
@@ -500,7 +516,7 @@
     </w:p>
     <w:bookmarkEnd w:id="18"/>
     <w:bookmarkEnd w:id="19"/>
-    <w:bookmarkStart w:id="20" w:name="metodología-el-protocolo-pre-registrado"/>
+    <w:bookmarkStart w:id="21" w:name="metodología-el-protocolo-pre-registrado"/>
     <w:p>
       <w:pPr>
         <w:pStyle w:val="Heading2"/>
@@ -656,8 +672,98 @@
         <w:t xml:space="preserve">: abanico empírico por horizonte (asimétrico si los errores lo son), intervalos conformal por grupo de renta, bandas de variantes demográficas.</w:t>
       </w:r>
     </w:p>
+    <w:bookmarkStart w:id="20" w:name="X5c0b3c22ee2b5566c4529d03bd109b10b6c0bd7"/>
+    <w:p>
+      <w:pPr>
+        <w:pStyle w:val="Heading3"/>
+      </w:pPr>
+      <w:r>
+        <w:t xml:space="preserve">3.1 Cómo se predicen los resultados: directa, encadenada y condicional</w:t>
+      </w:r>
+    </w:p>
+    <w:p>
+      <w:pPr>
+        <w:pStyle w:val="FirstParagraph"/>
+      </w:pPr>
+      <w:r>
+        <w:t xml:space="preserve">Tres arquitecturas conviven y la elección está gobernada por una regla única (detalle en</w:t>
+      </w:r>
+      <w:r>
+        <w:t xml:space="preserve"> </w:t>
+      </w:r>
+      <w:r>
+        <w:rPr>
+          <w:rStyle w:val="VerbatimChar"/>
+        </w:rPr>
+        <w:t xml:space="preserve">docs/arquitecturas_prediccion.md</w:t>
+      </w:r>
+      <w:r>
+        <w:t xml:space="preserve">): la predicción</w:t>
+      </w:r>
+      <w:r>
+        <w:t xml:space="preserve"> </w:t>
+      </w:r>
+      <w:r>
+        <w:rPr>
+          <w:b/>
+          <w:bCs/>
+        </w:rPr>
+        <w:t xml:space="preserve">directa</w:t>
+      </w:r>
+      <w:r>
+        <w:t xml:space="preserve"> </w:t>
+      </w:r>
+      <w:r>
+        <w:t xml:space="preserve">(el objetivo desde su propio pasado, con drivers solo retardados — T1 y todos sus candidatos); la</w:t>
+      </w:r>
+      <w:r>
+        <w:t xml:space="preserve"> </w:t>
+      </w:r>
+      <w:r>
+        <w:rPr>
+          <w:b/>
+          <w:bCs/>
+        </w:rPr>
+        <w:t xml:space="preserve">encadenada</w:t>
+      </w:r>
+      <w:r>
+        <w:t xml:space="preserve"> </w:t>
+      </w:r>
+      <w:r>
+        <w:t xml:space="preserve">o two-stage (predecir primero los drivers y convertirlos en objetivo con una regresión — D1: proyecciones demográficas × elasticidades entrenadas → presión de gasto → senda de deuda); y la</w:t>
+      </w:r>
+      <w:r>
+        <w:t xml:space="preserve"> </w:t>
+      </w:r>
+      <w:r>
+        <w:rPr>
+          <w:b/>
+          <w:bCs/>
+        </w:rPr>
+        <w:t xml:space="preserve">condicional</w:t>
+      </w:r>
+      <w:r>
+        <w:t xml:space="preserve"> </w:t>
+      </w:r>
+      <w:r>
+        <w:t xml:space="preserve">(la misma regresión con el driver fijado por el usuario — abanico salarial, palancas de deuda,</w:t>
+      </w:r>
+      <w:r>
+        <w:t xml:space="preserve"> </w:t>
+      </w:r>
+      <w:r>
+        <w:rPr>
+          <w:rStyle w:val="VerbatimChar"/>
+        </w:rPr>
+        <w:t xml:space="preserve">POST /scenario</w:t>
+      </w:r>
+      <w:r>
+        <w:t xml:space="preserve">). Encadenar solo compensa cuando el driver es mucho más fácil de predecir que el objetivo: la demografía lo cumple (los mayores de 2050 ya han nacido), los drivers de vivienda no — y el caso límite está medido: ni con los valores verdaderos de los drivers (retardados) ningún candidato batió al drift, luego una cadena con drivers previstos sería estrictamente peor. Cuando la regresión vale pero el driver es imprevisible, se degrada honestamente a máquina condicional en lugar de fingir un pronóstico.</w:t>
+      </w:r>
+    </w:p>
     <w:bookmarkEnd w:id="20"/>
-    <w:bookmarkStart w:id="43" w:name="resultados"/>
+    <w:bookmarkEnd w:id="21"/>
+    <w:bookmarkStart w:id="52" w:name="resultados"/>
     <w:p>
       <w:pPr>
         <w:pStyle w:val="Heading2"/>
@@ -666,7 +772,7 @@
         <w:t xml:space="preserve">4. Resultados</w:t>
       </w:r>
     </w:p>
-    <w:bookmarkStart w:id="27" w:name="X40bdec7db66af27902f967987e5f2fb28d253a6"/>
+    <w:bookmarkStart w:id="28" w:name="X40bdec7db66af27902f967987e5f2fb28d253a6"/>
     <w:p>
       <w:pPr>
         <w:pStyle w:val="Heading3"/>
@@ -804,18 +910,18 @@
           <wp:inline>
             <wp:extent cx="5334000" cy="2032000"/>
             <wp:effectExtent b="0" l="0" r="0" t="0"/>
-            <wp:docPr descr="El test final: el GBM pronosticó caída en pleno boom" title="" id="22" name="Picture"/>
+            <wp:docPr descr="El test final: el GBM pronosticó caída en pleno boom" title="" id="23" name="Picture"/>
             <a:graphic>
               <a:graphicData uri="http://schemas.openxmlformats.org/drawingml/2006/picture">
                 <pic:pic>
                   <pic:nvPicPr>
-                    <pic:cNvPr descr="figures/backtest/b3_test_final.png" id="23" name="Picture"/>
+                    <pic:cNvPr descr="figures/backtest/b3_test_final.png" id="24" name="Picture"/>
                     <pic:cNvPicPr>
                       <a:picLocks noChangeArrowheads="1" noChangeAspect="1"/>
                     </pic:cNvPicPr>
                   </pic:nvPicPr>
                   <pic:blipFill>
-                    <a:blip r:embed="rId21"/>
+                    <a:blip r:embed="rId22"/>
                     <a:stretch>
                       <a:fillRect/>
                     </a:stretch>
@@ -859,18 +965,18 @@
           <wp:inline>
             <wp:extent cx="5334000" cy="2761129"/>
             <wp:effectExtent b="0" l="0" r="0" t="0"/>
-            <wp:docPr descr="Pronóstico de producción con abanico empírico" title="" id="25" name="Picture"/>
+            <wp:docPr descr="Pronóstico de producción con abanico empírico" title="" id="26" name="Picture"/>
             <a:graphic>
               <a:graphicData uri="http://schemas.openxmlformats.org/drawingml/2006/picture">
                 <pic:pic>
                   <pic:nvPicPr>
-                    <pic:cNvPr descr="figures/backtest/b4_fan_nacional.png" id="26" name="Picture"/>
+                    <pic:cNvPr descr="figures/backtest/b4_fan_nacional.png" id="27" name="Picture"/>
                     <pic:cNvPicPr>
                       <a:picLocks noChangeArrowheads="1" noChangeAspect="1"/>
                     </pic:cNvPicPr>
                   </pic:nvPicPr>
                   <pic:blipFill>
-                    <a:blip r:embed="rId24"/>
+                    <a:blip r:embed="rId25"/>
                     <a:stretch>
                       <a:fillRect/>
                     </a:stretch>
@@ -928,8 +1034,8 @@
         <w:t xml:space="preserve">, compromiso de la Revisión 1) son la señal adelantada más fuerte encontrada (r=0,57 con 11 trimestres; 3 trimestres de aviso en el único giro de la muestra). Se adoptará solo si lo confirman los datos de 2026+.</w:t>
       </w:r>
     </w:p>
-    <w:bookmarkEnd w:id="27"/>
-    <w:bookmarkStart w:id="31" w:name="atlas-b1b16-el-siglo-del-gasto-público"/>
+    <w:bookmarkEnd w:id="28"/>
+    <w:bookmarkStart w:id="32" w:name="atlas-b1b16-el-siglo-del-gasto-público"/>
     <w:p>
       <w:pPr>
         <w:pStyle w:val="Heading3"/>
@@ -971,18 +1077,18 @@
           <wp:inline>
             <wp:extent cx="5334000" cy="2635623"/>
             <wp:effectExtent b="0" l="0" r="0" t="0"/>
-            <wp:docPr descr="Vivienda: palanca pública vs promoción privada" title="" id="29" name="Picture"/>
+            <wp:docPr descr="Vivienda: palanca pública vs promoción privada" title="" id="30" name="Picture"/>
             <a:graphic>
               <a:graphicData uri="http://schemas.openxmlformats.org/drawingml/2006/picture">
                 <pic:pic>
                   <pic:nvPicPr>
-                    <pic:cNvPr descr="figures/atlas/b03_vivienda_publica_vs_total.png" id="30" name="Picture"/>
+                    <pic:cNvPr descr="figures/atlas/b03_vivienda_publica_vs_total.png" id="31" name="Picture"/>
                     <pic:cNvPicPr>
                       <a:picLocks noChangeArrowheads="1" noChangeAspect="1"/>
                     </pic:cNvPicPr>
                   </pic:nvPicPr>
                   <pic:blipFill>
-                    <a:blip r:embed="rId28"/>
+                    <a:blip r:embed="rId29"/>
                     <a:stretch>
                       <a:fillRect/>
                     </a:stretch>
@@ -1017,8 +1123,8 @@
         <w:t xml:space="preserve">Vivienda: palanca pública vs promoción privada</w:t>
       </w:r>
     </w:p>
-    <w:bookmarkEnd w:id="31"/>
-    <w:bookmarkStart w:id="35" w:name="X6d4b13f6a5cfc0988c64a32969d5d170c901cd4"/>
+    <w:bookmarkEnd w:id="32"/>
+    <w:bookmarkStart w:id="36" w:name="X6d4b13f6a5cfc0988c64a32969d5d170c901cd4"/>
     <w:p>
       <w:pPr>
         <w:pStyle w:val="Heading3"/>
@@ -1094,18 +1200,18 @@
           <wp:inline>
             <wp:extent cx="5334000" cy="2963333"/>
             <wp:effectExtent b="0" l="0" r="0" t="0"/>
-            <wp:docPr descr="Funnel A1: años de vida sobre lo esperado, con intervalo" title="" id="33" name="Picture"/>
+            <wp:docPr descr="Funnel A1: años de vida sobre lo esperado, con intervalo" title="" id="34" name="Picture"/>
             <a:graphic>
               <a:graphicData uri="http://schemas.openxmlformats.org/drawingml/2006/picture">
                 <pic:pic>
                   <pic:nvPicPr>
-                    <pic:cNvPr descr="figures/a1/a1_funnel.png" id="34" name="Picture"/>
+                    <pic:cNvPr descr="figures/a1/a1_funnel.png" id="35" name="Picture"/>
                     <pic:cNvPicPr>
                       <a:picLocks noChangeArrowheads="1" noChangeAspect="1"/>
                     </pic:cNvPicPr>
                   </pic:nvPicPr>
                   <pic:blipFill>
-                    <a:blip r:embed="rId32"/>
+                    <a:blip r:embed="rId33"/>
                     <a:stretch>
                       <a:fillRect/>
                     </a:stretch>
@@ -1140,8 +1246,8 @@
         <w:t xml:space="preserve">Funnel A1: años de vida sobre lo esperado, con intervalo</w:t>
       </w:r>
     </w:p>
-    <w:bookmarkEnd w:id="35"/>
-    <w:bookmarkStart w:id="36" w:name="X92e70db459f51d92f99d601b202d085f075b998"/>
+    <w:bookmarkEnd w:id="36"/>
+    <w:bookmarkStart w:id="37" w:name="X92e70db459f51d92f99d601b202d085f075b998"/>
     <w:p>
       <w:pPr>
         <w:pStyle w:val="Heading3"/>
@@ -1198,8 +1304,420 @@
         <w:t xml:space="preserve">(protección social +3,2 pp; España aquí, con el 40,9 % del gasto en protección social). El eje principal se lee casi como renta + antigüedad en la UE — coherente con A1.</w:t>
       </w:r>
     </w:p>
-    <w:bookmarkEnd w:id="36"/>
-    <w:bookmarkStart w:id="40" w:name="d1-escenarios-de-deuda-20242050"/>
+    <w:bookmarkEnd w:id="37"/>
+    <w:bookmarkStart w:id="38" w:name="X5f8505af31b2115ac4a36bee490082d95f0eb86"/>
+    <w:p>
+      <w:pPr>
+        <w:pStyle w:val="Heading3"/>
+      </w:pPr>
+      <w:r>
+        <w:t xml:space="preserve">4.3-ter Expansión del corpus: educación, SPI y cuota teórica</w:t>
+      </w:r>
+    </w:p>
+    <w:p>
+      <w:pPr>
+        <w:pStyle w:val="FirstParagraph"/>
+      </w:pPr>
+      <w:r>
+        <w:t xml:space="preserve">Tras la Entrega 4 se implementaron los conectores pendientes alcanzables (valor tasado MITMA €/m², SPI, gasto militar, gasto educativo, HLO, AOD donante — ver</w:t>
+      </w:r>
+      <w:r>
+        <w:t xml:space="preserve"> </w:t>
+      </w:r>
+      <w:r>
+        <w:rPr>
+          <w:rStyle w:val="VerbatimChar"/>
+        </w:rPr>
+        <w:t xml:space="preserve">docs/expansion_corpus.md</w:t>
+      </w:r>
+      <w:r>
+        <w:t xml:space="preserve">) y con ellos tres piezas nuevas. (1)</w:t>
+      </w:r>
+      <w:r>
+        <w:t xml:space="preserve"> </w:t>
+      </w:r>
+      <w:r>
+        <w:rPr>
+          <w:b/>
+          <w:bCs/>
+        </w:rPr>
+        <w:t xml:space="preserve">Cuota hipotecaria teórica por CCAA</w:t>
+      </w:r>
+      <w:r>
+        <w:t xml:space="preserve"> </w:t>
+      </w:r>
+      <w:r>
+        <w:t xml:space="preserve">(compromiso con el tutor): con hipoteca tipo de 90 m², LTV 80 %, 25 años y Euríbor 2024 +1 pp, el esfuerzo nacional es el</w:t>
+      </w:r>
+      <w:r>
+        <w:t xml:space="preserve"> </w:t>
+      </w:r>
+      <w:r>
+        <w:rPr>
+          <w:b/>
+          <w:bCs/>
+        </w:rPr>
+        <w:t xml:space="preserve">41,6 % del salario bruto</w:t>
+      </w:r>
+      <w:r>
+        <w:t xml:space="preserve"> </w:t>
+      </w:r>
+      <w:r>
+        <w:t xml:space="preserve">(Baleares 60,6 %, Madrid 56,0 %); ordena las CCAA casi igual que el ratio índice del panel (Spearman 0,79), validando el proxy y añadiendo la medida en euros. (2)</w:t>
+      </w:r>
+      <w:r>
+        <w:t xml:space="preserve"> </w:t>
+      </w:r>
+      <w:r>
+        <w:rPr>
+          <w:b/>
+          <w:bCs/>
+        </w:rPr>
+        <w:t xml:space="preserve">A1-educación</w:t>
+      </w:r>
+      <w:r>
+        <w:t xml:space="preserve"> </w:t>
+      </w:r>
+      <w:r>
+        <w:t xml:space="preserve">(157 países): HLO ~ gasto educativo retardado + renta + urbanización bajo LOOCV; el OLS vuelve a ganar (MAE 32,7 puntos; GBM 31,2 y MLP 33,4 no cumplen la regla del −10 %), España queda dentro de banda (+37 ± 78) y los extremos son Vietnam (+111) y Kuwait (−100). (3)</w:t>
+      </w:r>
+      <w:r>
+        <w:t xml:space="preserve"> </w:t>
+      </w:r>
+      <w:r>
+        <w:rPr>
+          <w:b/>
+          <w:bCs/>
+        </w:rPr>
+        <w:t xml:space="preserve">Auditoría SPI declarada en el PLAN</w:t>
+      </w:r>
+      <w:r>
+        <w:t xml:space="preserve">: Spearman(residual A1-salud, SPI) =</w:t>
+      </w:r>
+      <w:r>
+        <w:t xml:space="preserve"> </w:t>
+      </w:r>
+      <w:r>
+        <w:rPr>
+          <w:b/>
+          <w:bCs/>
+        </w:rPr>
+        <w:t xml:space="preserve">+0,08</w:t>
+      </w:r>
+      <w:r>
+        <w:t xml:space="preserve"> </w:t>
+      </w:r>
+      <w:r>
+        <w:t xml:space="preserve">sobre 163 países — el</w:t>
+      </w:r>
+      <w:r>
+        <w:t xml:space="preserve"> </w:t>
+      </w:r>
+      <w:r>
+        <w:t xml:space="preserve">“rendimiento”</w:t>
+      </w:r>
+      <w:r>
+        <w:t xml:space="preserve"> </w:t>
+      </w:r>
+      <w:r>
+        <w:t xml:space="preserve">estimado no es un artefacto de capacidad estadística; añadir SPI como control tampoco mueve el MAE (2,76→2,75). El contraste</w:t>
+      </w:r>
+      <w:r>
+        <w:t xml:space="preserve"> </w:t>
+      </w:r>
+      <w:r>
+        <w:t xml:space="preserve">“deep learning”</w:t>
+      </w:r>
+      <w:r>
+        <w:t xml:space="preserve"> </w:t>
+      </w:r>
+      <w:r>
+        <w:t xml:space="preserve">(MLP) se ejecutó bajo las mismas reglas pre-registradas y perdió en ambos módulos: con n≈150 países la señal la captura la estructura lineal, y así se defiende.</w:t>
+      </w:r>
+    </w:p>
+    <w:bookmarkEnd w:id="38"/>
+    <w:bookmarkStart w:id="39" w:name="quater-capas-de-demanda-crédito-y-suelo"/>
+    <w:p>
+      <w:pPr>
+        <w:pStyle w:val="Heading3"/>
+      </w:pPr>
+      <w:r>
+        <w:t xml:space="preserve">4.3-quater Capas de demanda, crédito y suelo</w:t>
+      </w:r>
+    </w:p>
+    <w:p>
+      <w:pPr>
+        <w:pStyle w:val="FirstParagraph"/>
+      </w:pPr>
+      <w:r>
+        <w:t xml:space="preserve">Segunda expansión (</w:t>
+      </w:r>
+      <w:r>
+        <w:rPr>
+          <w:rStyle w:val="VerbatimChar"/>
+        </w:rPr>
+        <w:t xml:space="preserve">docs/demanda_suelo.md</w:t>
+      </w:r>
+      <w:r>
+        <w:t xml:space="preserve">): compraventas e hipotecas mensuales por CCAA (INE), población trimestral por CCAA desde 1971 (ECP), mercado de suelo trimestral 2004– (MITMA: número, valor, superficie y precio de transacciones), stock de suelo urbanizable planificado por CCAA (SIU 2021 y 2025) y criterios de crédito vivienda (ECB BLS 2003–). Hallazgos descriptivos: la superficie de suelo transmitida sigue a ~1/5 del pico de 2004 (117→25 millones m²) mientras los precios aceleran, y Madrid reduce su suelo urbanizable (9,4 %→8,9 % con cobertura completa) — la restricción de oferta empieza aguas arriba de los visados. El contest de validación con estas capas como features rezagadas produjo el</w:t>
+      </w:r>
+      <w:r>
+        <w:t xml:space="preserve"> </w:t>
+      </w:r>
+      <w:r>
+        <w:rPr>
+          <w:b/>
+          <w:bCs/>
+        </w:rPr>
+        <w:t xml:space="preserve">cuarto resultado negativo pre-registrado</w:t>
+      </w:r>
+      <w:r>
+        <w:t xml:space="preserve"> </w:t>
+      </w:r>
+      <w:r>
+        <w:t xml:space="preserve">(GBM+demanda 0/17 CCAA vs drift; MASE 0,653 vs 0,395): el modelo de producción sigue siendo el drift, y las capas quedan como valor descriptivo y opción de giro validable solo con datos 2026+.</w:t>
+      </w:r>
+    </w:p>
+    <w:bookmarkEnd w:id="39"/>
+    <w:bookmarkStart w:id="40" w:name="X3cf67159036d9c8ffae7f4c2337730a173a4576"/>
+    <w:p>
+      <w:pPr>
+        <w:pStyle w:val="Heading3"/>
+      </w:pPr>
+      <w:r>
+        <w:t xml:space="preserve">4.3-quinquies Panel internacional de vivienda y suelo</w:t>
+      </w:r>
+    </w:p>
+    <w:p>
+      <w:pPr>
+        <w:pStyle w:val="FirstParagraph"/>
+      </w:pPr>
+      <w:r>
+        <w:t xml:space="preserve">Con BIS (precios reales, 61 áreas, ES desde 1971), OCDE (precio/renta disponible, 50 países) y suelo artificial satelital (OCDE/ESA 2000–2022) se construyó</w:t>
+      </w:r>
+      <w:r>
+        <w:t xml:space="preserve"> </w:t>
+      </w:r>
+      <w:r>
+        <w:rPr>
+          <w:rStyle w:val="VerbatimChar"/>
+        </w:rPr>
+        <w:t xml:space="preserve">gold_vivienda_global.csv</w:t>
+      </w:r>
+      <w:r>
+        <w:t xml:space="preserve"> </w:t>
+      </w:r>
+      <w:r>
+        <w:t xml:space="preserve">(</w:t>
+      </w:r>
+      <w:r>
+        <w:rPr>
+          <w:rStyle w:val="VerbatimChar"/>
+        </w:rPr>
+        <w:t xml:space="preserve">docs/vivienda_global.md</w:t>
+      </w:r>
+      <w:r>
+        <w:t xml:space="preserve">, figura b18). España: +46 % real desde 2015 y precio/renta 132,5 (2015=100), en la senda portuguesa (+125 %, 178,8) y lejos de la italiana (−3,7 %, 89,1). El dato incómodo: España es también el país núcleo que más suelo artificial ha creado (+120 % desde 2000, el doble que Alemania) — y transversalmente, en 40 países, Spearman(precio/renta, crecimiento de suelo artificial) = +0,01:</w:t>
+      </w:r>
+      <w:r>
+        <w:t xml:space="preserve"> </w:t>
+      </w:r>
+      <w:r>
+        <w:rPr>
+          <w:b/>
+          <w:bCs/>
+        </w:rPr>
+        <w:t xml:space="preserve">urbanizar más suelo no compra asequibilidad</w:t>
+      </w:r>
+      <w:r>
+        <w:t xml:space="preserve">; el cuello de botella es el suelo que llega al mercado (transacciones a 1/5 del pico), no el consumido. Declarado: no existe €/m² comparable abierto ni suelo urbanizable legal armonizado entre países — el SIU español es una rareza estadística.</w:t>
+      </w:r>
+    </w:p>
+    <w:bookmarkEnd w:id="40"/>
+    <w:bookmarkStart w:id="41" w:name="Xe0a6489e188f475ab2384e234847d405449003e"/>
+    <w:p>
+      <w:pPr>
+        <w:pStyle w:val="Heading3"/>
+      </w:pPr>
+      <w:r>
+        <w:t xml:space="preserve">4.3-sexies Deep learning de verdad: dos rutas contra el protocolo</w:t>
+      </w:r>
+    </w:p>
+    <w:p>
+      <w:pPr>
+        <w:pStyle w:val="FirstParagraph"/>
+      </w:pPr>
+      <w:r>
+        <w:t xml:space="preserve">Con las bases que sí permiten entrenar DL (</w:t>
+      </w:r>
+      <w:r>
+        <w:rPr>
+          <w:rStyle w:val="VerbatimChar"/>
+        </w:rPr>
+        <w:t xml:space="preserve">docs/dl_rutas.md</w:t>
+      </w:r>
+      <w:r>
+        <w:t xml:space="preserve">): (a)</w:t>
+      </w:r>
+      <w:r>
+        <w:t xml:space="preserve"> </w:t>
+      </w:r>
+      <w:r>
+        <w:rPr>
+          <w:b/>
+          <w:bCs/>
+        </w:rPr>
+        <w:t xml:space="preserve">Chronos-Bolt zero-shot</w:t>
+      </w:r>
+      <w:r>
+        <w:t xml:space="preserve"> </w:t>
+      </w:r>
+      <w:r>
+        <w:t xml:space="preserve">(fundacional, preentrenado en millones de series): MASE h≤4 0,460 — mejor que todo candidato clásico, por debajo del drift (0,395) en todos los horizontes y roto a h≥6; 0/17 CCAA. (b)</w:t>
+      </w:r>
+      <w:r>
+        <w:t xml:space="preserve"> </w:t>
+      </w:r>
+      <w:r>
+        <w:rPr>
+          <w:b/>
+          <w:bCs/>
+        </w:rPr>
+        <w:t xml:space="preserve">DL global entrenado en 1.760 series regionales extranjeras</w:t>
+      </w:r>
+      <w:r>
+        <w:t xml:space="preserve"> </w:t>
+      </w:r>
+      <w:r>
+        <w:t xml:space="preserve">(FHFA+Zillow+UK, 208.640 observaciones, 113.649 ventanas con objetivo ≤2019Q3, España nunca en el entrenamiento):</w:t>
+      </w:r>
+      <w:r>
+        <w:t xml:space="preserve"> </w:t>
+      </w:r>
+      <w:r>
+        <w:rPr>
+          <w:b/>
+          <w:bCs/>
+        </w:rPr>
+        <w:t xml:space="preserve">empate técnico con el campeón</w:t>
+      </w:r>
+      <w:r>
+        <w:t xml:space="preserve"> </w:t>
+      </w:r>
+      <w:r>
+        <w:t xml:space="preserve">— MASE h≤4 0,401 vs 0,395, gana en 7/17 CCAA y bate al drift en h=2. No alcanza el criterio (12/17) y no se adopta; es el primer candidato en cinco contests que llega al empate, y la lectura es direccional: el corpus de dominio (ciclos inmobiliarios extranjeros completos) aporta lo que ni las features ricas ni el preentrenamiento genérico aportaron. Revalidación declarada solo con orígenes 2026+; si el ciclo español gira, esta es la apuesta auditable en tiempo real.</w:t>
+      </w:r>
+    </w:p>
+    <w:bookmarkEnd w:id="41"/>
+    <w:bookmarkStart w:id="42" w:name="X5566791e8a024aa4146954a42e43fceee3ad762"/>
+    <w:p>
+      <w:pPr>
+        <w:pStyle w:val="Heading3"/>
+      </w:pPr>
+      <w:r>
+        <w:t xml:space="preserve">4.3-septies Desglose fiscal mundial y reconciliación de fuentes</w:t>
+      </w:r>
+    </w:p>
+    <w:p>
+      <w:pPr>
+        <w:pStyle w:val="FirstParagraph"/>
+      </w:pPr>
+      <w:r>
+        <w:t xml:space="preserve">Con la API nueva del FMI se incorporaron el gasto por función COFOG de 89 países (GFS_COFOG, 1972–2025) y los ingresos por tipo de 195 países (WoRLD, 1980–2024), más las Global Revenue Statistics de la OCDE (146 países) como compilación independiente (</w:t>
+      </w:r>
+      <w:r>
+        <w:rPr>
+          <w:rStyle w:val="VerbatimChar"/>
+        </w:rPr>
+        <w:t xml:space="preserve">docs/fiscal_breakdown.md</w:t>
+      </w:r>
+      <w:r>
+        <w:t xml:space="preserve">). La reconciliación cruzada — 15/15 checks OK en</w:t>
+      </w:r>
+      <w:r>
+        <w:t xml:space="preserve"> </w:t>
+      </w:r>
+      <w:r>
+        <w:rPr>
+          <w:rStyle w:val="VerbatimChar"/>
+        </w:rPr>
+        <w:t xml:space="preserve">gold_fiscal_reconciliation.csv</w:t>
+      </w:r>
+      <w:r>
+        <w:t xml:space="preserve"> </w:t>
+      </w:r>
+      <w:r>
+        <w:t xml:space="preserve">— valida los valores que el proyecto venía usando: Eurostat e IMF coinciden función a función con brechas de 0,03–0,06 pp de PIB; ingresos totales cuadran a 0,3–0,7 pp entre tres fuentes; la única brecha sistemática (Rumanía, 3–4,5 pp vs WEO) es metodológica (caja vs devengo) y queda declarada como regla operativa: Eurostat canónico en la UE, GFS/WoRLD fuera, WEO solo para totales largos y proyecciones. España validada: gasto 2024 con protección social 18,7 y salud 6,3 % PIB; ingresos 2023 = 41,2 % (impuestos 23,6 + cotizaciones 13,2 + resto), con IRPF (8,7) triplicando sociedades (2,9).</w:t>
+      </w:r>
+    </w:p>
+    <w:bookmarkEnd w:id="42"/>
+    <w:bookmarkStart w:id="43" w:name="Xfb89f645c70935ee7ce17d02d88ee9c65337a31"/>
+    <w:p>
+      <w:pPr>
+        <w:pStyle w:val="Heading3"/>
+      </w:pPr>
+      <w:r>
+        <w:t xml:space="preserve">4.3-octies Series históricas: denominador verificado y empalme 1703–2025</w:t>
+      </w:r>
+    </w:p>
+    <w:p>
+      <w:pPr>
+        <w:pStyle w:val="FirstParagraph"/>
+      </w:pPr>
+      <w:r>
+        <w:t xml:space="preserve">Con los niveles de JST (PIB, ingresos y gasto en moneda corriente) se verificó que los porcentajes son reproducibles desde cifras primarias (recalculado vs publicado: 0,000000 pp en 2.516 país-años) — tenemos el PIB, no ratios opacos. La reconciliación del solape 1995–2020 descubrió la trampa clásica de las series largas y la midió: JST es solo administración central (brecha 21 pp vs Eurostat), WEO salta de perímetro justo en 1995 (ES 12,8→44,5), y GMD es el único continuo en perímetro AAPP (0,04 pp de brecha) → empalme canónico = Eurostat 1995+ + GMD antes (</w:t>
+      </w:r>
+      <w:r>
+        <w:rPr>
+          <w:rStyle w:val="VerbatimChar"/>
+        </w:rPr>
+        <w:t xml:space="preserve">gold_fiscal_historico.csv</w:t>
+      </w:r>
+      <w:r>
+        <w:t xml:space="preserve">, figura b19,</w:t>
+      </w:r>
+      <w:r>
+        <w:t xml:space="preserve"> </w:t>
+      </w:r>
+      <w:r>
+        <w:rPr>
+          <w:rStyle w:val="VerbatimChar"/>
+        </w:rPr>
+        <w:t xml:space="preserve">docs/fiscal_historia.md</w:t>
+      </w:r>
+      <w:r>
+        <w:t xml:space="preserve">). España 1703–2025 queda contada en una sola serie: Estado del 10 % en 1900, transición fiscal 1977–1995 (+15 pp en 18 años, el evento del siglo), déficit crónico solo desde el Estado del bienestar, tijera de 11,5 pp en 2012.</w:t>
+      </w:r>
+    </w:p>
+    <w:bookmarkEnd w:id="43"/>
+    <w:bookmarkStart w:id="44" w:name="Xfb03efeef85515f4ebdaca6f85ea60a3ebaa2c2"/>
+    <w:p>
+      <w:pPr>
+        <w:pStyle w:val="Heading3"/>
+      </w:pPr>
+      <w:r>
+        <w:t xml:space="preserve">4.3-nonies Bienestar y pobreza infantil: el marco MPI contra el dinero público</w:t>
+      </w:r>
+    </w:p>
+    <w:p>
+      <w:pPr>
+        <w:pStyle w:val="FirstParagraph"/>
+      </w:pPr>
+      <w:r>
+        <w:t xml:space="preserve">Los 7 bloques del marco bienestar↔pobreza infantil (UN/WB/UNICEF) quedan mapeados a 13 series abiertas + AROPE infantil UE (</w:t>
+      </w:r>
+      <w:r>
+        <w:rPr>
+          <w:rStyle w:val="VerbatimChar"/>
+        </w:rPr>
+        <w:t xml:space="preserve">docs/bienestar_indicadores.md</w:t>
+      </w:r>
+      <w:r>
+        <w:t xml:space="preserve">), y la frontera A1 se replica en un tercer dominio con el ingreso público (WoRLD) como dinero de entrada: log-mortalidad &lt;5 (185 países) y stunting (124) ~ ingresos + renta + urbanización, LOOCV, conformal por cuartil. El OLS vuelve a ganar en ambos (GBM no cumple; MLP omitido y declarado). España mejor que lo esperado y dentro de banda (−0,51±0,93); los extremos validan el método (Guinea Ecuatorial ≈8,5× la mortalidad esperada para su renta; Guatemala +29 pp de stunting). Descriptivo del marco completo: Spearman(ingresos públicos, dimensión) entre −0,60 (mortalidad) y +0,56 (agua segura), todas las direcciones correctas — más capacidad fiscal, menos privación en las 7 dimensiones, y la frontera identifica quién convierte mejor a renta comparable. Cierra el triángulo del proyecto: gasto por función + ingresos por tipo + resultados de bienestar objetivos.</w:t>
+      </w:r>
+    </w:p>
+    <w:bookmarkEnd w:id="44"/>
+    <w:bookmarkStart w:id="48" w:name="d1-escenarios-de-deuda-20242050"/>
     <w:p>
       <w:pPr>
         <w:pStyle w:val="Heading3"/>
@@ -1241,18 +1759,18 @@
           <wp:inline>
             <wp:extent cx="5334000" cy="2919663"/>
             <wp:effectExtent b="0" l="0" r="0" t="0"/>
-            <wp:docPr descr="Menú de escenarios de deuda 2024–2050" title="" id="38" name="Picture"/>
+            <wp:docPr descr="Menú de escenarios de deuda 2024–2050" title="" id="46" name="Picture"/>
             <a:graphic>
               <a:graphicData uri="http://schemas.openxmlformats.org/drawingml/2006/picture">
                 <pic:pic>
                   <pic:nvPicPr>
-                    <pic:cNvPr descr="figures/d1/d1_deuda_escenarios.png" id="39" name="Picture"/>
+                    <pic:cNvPr descr="figures/d1/d1_deuda_escenarios.png" id="47" name="Picture"/>
                     <pic:cNvPicPr>
                       <a:picLocks noChangeArrowheads="1" noChangeAspect="1"/>
                     </pic:cNvPicPr>
                   </pic:nvPicPr>
                   <pic:blipFill>
-                    <a:blip r:embed="rId37"/>
+                    <a:blip r:embed="rId45"/>
                     <a:stretch>
                       <a:fillRect/>
                     </a:stretch>
@@ -1287,14 +1805,14 @@
         <w:t xml:space="preserve">Menú de escenarios de deuda 2024–2050</w:t>
       </w:r>
     </w:p>
-    <w:bookmarkEnd w:id="40"/>
-    <w:bookmarkStart w:id="41" w:name="el-producto-mvp"/>
+    <w:bookmarkEnd w:id="48"/>
+    <w:bookmarkStart w:id="49" w:name="X9e0299a6af8e857b94f001de4e9de71b7521d9c"/>
     <w:p>
       <w:pPr>
         <w:pStyle w:val="Heading3"/>
       </w:pPr>
       <w:r>
-        <w:t xml:space="preserve">4.5 El producto (MVP)</w:t>
+        <w:t xml:space="preserve">4.4-bis Horizonte 50 años: sobres condicionales de economía y bienestar</w:t>
       </w:r>
     </w:p>
     <w:p>
@@ -1302,11 +1820,139 @@
         <w:pStyle w:val="FirstParagraph"/>
       </w:pPr>
       <w:r>
-        <w:t xml:space="preserve">API FastAPI que sirve todos los artefactos gold (pronóstico con abanico, funnel, menú de escenarios, simulador interactivo con palancas, proyecciones demográficas) y dashboard Streamlit de cuatro pestañas. Las advertencias de método viajan dentro de las respuestas de la API y de cada pestaña: la honestidad es parte del producto, no de la letra pequeña.</w:t>
-      </w:r>
-    </w:p>
-    <w:bookmarkEnd w:id="41"/>
-    <w:bookmarkStart w:id="42" w:name="por-qué-no-basta-un-llm"/>
+        <w:t xml:space="preserve">El sistema se extiende a 2070 como máquina de sobres condicionales — nunca como pronosticador — con cinco piezas (</w:t>
+      </w:r>
+      <w:r>
+        <w:rPr>
+          <w:rStyle w:val="VerbatimChar"/>
+        </w:rPr>
+        <w:t xml:space="preserve">docs/horizonte_50.md</w:t>
+      </w:r>
+      <w:r>
+        <w:t xml:space="preserve">): (1) la frontera ingreso→bienestar re-estimada como PANEL within (184 países, FE país+año, CR1): el efecto del ingreso es nulo a 2–5 años y aparece a retardo 8 (−0,0036±0,0015 por pp), ~3× menor que el transversal — simular con el transversal sobrestimaría lo que compra el dinero; la renta domina (γ=−0,51±0,06). (2) Monte Carlo del simulador de deuda con la incertidumbre de parámetros propagada (4.000 trayectorias × escenario; coherente con el menú discreto: central 2050 mediana 231 vs 224, banda 90 % más ancha como debe). (3) Horizonte 2070 (EUROPOP): central mediana 409 % PIB [272–619] — el ancho ES el mensaje. (4) Sobres de bienestar 2050/2070 encadenando solo parámetros within: crecimiento 1 % pc/año → mortalidad &lt;5 −12 %/−21 % vs senda base; la palanca fiscal ±2,5 pp añade ±0,8 % — real pero de segundo orden. (5) Pseudo-backtest de continuidad sobre las DOS ventanas reales de 50 años del panel histórico (1925→1975, 1975→2025): errores medianos 12,7–21,5 pp de PIB congelando, peores extrapolando tendencia (p90 102 pp); España +19 pp (la transición fiscal, invisible para la continuidad).</w:t>
+      </w:r>
+      <w:r>
+        <w:t xml:space="preserve"> </w:t>
+      </w:r>
+      <w:r>
+        <w:rPr>
+          <w:b/>
+          <w:bCs/>
+        </w:rPr>
+        <w:t xml:space="preserve">Calibración fijada: todo sobre a 50 años más estrecho de ~13 pp de PIB finge certeza.</w:t>
+      </w:r>
+      <w:r>
+        <w:t xml:space="preserve"> </w:t>
+      </w:r>
+      <w:r>
+        <w:t xml:space="preserve">Un solo driver pronosticado (demografía); todo lo demás, palanca expuesta.</w:t>
+      </w:r>
+    </w:p>
+    <w:bookmarkEnd w:id="49"/>
+    <w:bookmarkStart w:id="50" w:name="Xbf8ebb698038c301a42ba650d865652043dcc08"/>
+    <w:p>
+      <w:pPr>
+        <w:pStyle w:val="Heading3"/>
+      </w:pPr>
+      <w:r>
+        <w:t xml:space="preserve">4.5 El producto (MVP): dashboard publicado, API y arranque garantizado</w:t>
+      </w:r>
+    </w:p>
+    <w:p>
+      <w:pPr>
+        <w:pStyle w:val="FirstParagraph"/>
+      </w:pPr>
+      <w:r>
+        <w:t xml:space="preserve">Tres superficies sobre la misma capa gold. (1)</w:t>
+      </w:r>
+      <w:r>
+        <w:t xml:space="preserve"> </w:t>
+      </w:r>
+      <w:r>
+        <w:rPr>
+          <w:b/>
+          <w:bCs/>
+        </w:rPr>
+        <w:t xml:space="preserve">Dashboard Streamlit de cinco pestañas</w:t>
+      </w:r>
+      <w:r>
+        <w:t xml:space="preserve"> </w:t>
+      </w:r>
+      <w:r>
+        <w:t xml:space="preserve">(asequibilidad con abanico, atlas, funnel A1, simulador de deuda con palancas, horizonte 50 años con Monte Carlo),</w:t>
+      </w:r>
+      <w:r>
+        <w:t xml:space="preserve"> </w:t>
+      </w:r>
+      <w:r>
+        <w:rPr>
+          <w:b/>
+          <w:bCs/>
+        </w:rPr>
+        <w:t xml:space="preserve">publicado en abierto</w:t>
+      </w:r>
+      <w:r>
+        <w:t xml:space="preserve"> </w:t>
+      </w:r>
+      <w:r>
+        <w:t xml:space="preserve">en https://tfm-data-science-ufgfhpcvydyrswwzm7t6sz.streamlit.app/ — se redespliega automáticamente con cada push al repositorio. (2)</w:t>
+      </w:r>
+      <w:r>
+        <w:t xml:space="preserve"> </w:t>
+      </w:r>
+      <w:r>
+        <w:rPr>
+          <w:b/>
+          <w:bCs/>
+        </w:rPr>
+        <w:t xml:space="preserve">API FastAPI</w:t>
+      </w:r>
+      <w:r>
+        <w:t xml:space="preserve"> </w:t>
+      </w:r>
+      <w:r>
+        <w:t xml:space="preserve">con todos los artefactos y el simulador interactivo (</w:t>
+      </w:r>
+      <w:r>
+        <w:rPr>
+          <w:rStyle w:val="VerbatimChar"/>
+        </w:rPr>
+        <w:t xml:space="preserve">POST /scenario</w:t>
+      </w:r>
+      <w:r>
+        <w:t xml:space="preserve">). (3)</w:t>
+      </w:r>
+      <w:r>
+        <w:t xml:space="preserve"> </w:t>
+      </w:r>
+      <w:r>
+        <w:rPr>
+          <w:b/>
+          <w:bCs/>
+        </w:rPr>
+        <w:t xml:space="preserve">Arranque garantizado con Docker</w:t>
+      </w:r>
+      <w:r>
+        <w:t xml:space="preserve">:</w:t>
+      </w:r>
+      <w:r>
+        <w:t xml:space="preserve"> </w:t>
+      </w:r>
+      <w:r>
+        <w:rPr>
+          <w:rStyle w:val="VerbatimChar"/>
+        </w:rPr>
+        <w:t xml:space="preserve">docker compose up --build</w:t>
+      </w:r>
+      <w:r>
+        <w:t xml:space="preserve"> </w:t>
+      </w:r>
+      <w:r>
+        <w:t xml:space="preserve">levanta dashboard (8501) y API (8010) con los datos dentro de las imágenes — replicar no requiere Python, dependencias ni descargas; también sirve como modo sin-red para la defensa. Las advertencias de método viajan dentro de las respuestas de la API y de cada pestaña: la honestidad es parte del producto, no de la letra pequeña.</w:t>
+      </w:r>
+    </w:p>
+    <w:bookmarkEnd w:id="50"/>
+    <w:bookmarkStart w:id="51" w:name="por-qué-no-basta-un-llm"/>
     <w:p>
       <w:pPr>
         <w:pStyle w:val="Heading3"/>
@@ -1520,9 +2166,9 @@
         <w:t xml:space="preserve">: en este proyecto se emplearon asistentes LLM como herramienta de programación y redacción (proceso), nunca como fuente de los números (producto). El asistente RAG previsto como extensión es el papel correcto de un LLM aquí: interfaz de lenguaje natural SOBRE los artefactos calculados — el LLM narra, el sistema calcula.</w:t>
       </w:r>
     </w:p>
-    <w:bookmarkEnd w:id="42"/>
-    <w:bookmarkEnd w:id="43"/>
-    <w:bookmarkStart w:id="44" w:name="limitaciones"/>
+    <w:bookmarkEnd w:id="51"/>
+    <w:bookmarkEnd w:id="52"/>
+    <w:bookmarkStart w:id="53" w:name="limitaciones"/>
     <w:p>
       <w:pPr>
         <w:pStyle w:val="Heading2"/>
@@ -1670,8 +2316,8 @@
         <w:t xml:space="preserve">: nada de lo dicho a nivel país habla de centros, sistemas o personas concretas.</w:t>
       </w:r>
     </w:p>
-    <w:bookmarkEnd w:id="44"/>
-    <w:bookmarkStart w:id="45" w:name="conclusiones"/>
+    <w:bookmarkEnd w:id="53"/>
+    <w:bookmarkStart w:id="54" w:name="conclusiones"/>
     <w:p>
       <w:pPr>
         <w:pStyle w:val="Heading2"/>
@@ -1723,8 +2369,8 @@
         <w:t xml:space="preserve">Sustantivamente: la asequibilidad española no se corrige sola (ni con salarios al 4 %); la palanca pública de vivienda es un orden de magnitud menor que la promoción privada; la renta domina el rendimiento sanitario entre países; y la demografía domina la senda de deuda por encima de cualquier palanca fiscal individual.</w:t>
       </w:r>
     </w:p>
-    <w:bookmarkEnd w:id="45"/>
-    <w:bookmarkStart w:id="46" w:name="trabajo-futuro"/>
+    <w:bookmarkEnd w:id="54"/>
+    <w:bookmarkStart w:id="55" w:name="trabajo-futuro"/>
     <w:p>
       <w:pPr>
         <w:pStyle w:val="Heading2"/>
@@ -1741,8 +2387,8 @@
         <w:t xml:space="preserve">Pata provincial de visados (MITMA) y evaluación del driver de oferta con datos 2026+; cuota hipotecaria teórica con €/m²; panel quinquenal para A1 y módulos vivienda/educación; episodios históricos de consolidación (D2); actualización trimestral automática del pipeline; registro formal de modelos y versiones (hoy el versionado es git + artefactos gold, suficiente a esta escala pero explícitamente mínimo).</w:t>
       </w:r>
     </w:p>
-    <w:bookmarkEnd w:id="46"/>
-    <w:bookmarkStart w:id="47" w:name="referencias"/>
+    <w:bookmarkEnd w:id="55"/>
+    <w:bookmarkStart w:id="56" w:name="referencias"/>
     <w:p>
       <w:pPr>
         <w:pStyle w:val="Heading2"/>
@@ -2460,8 +3106,8 @@
         <w:t xml:space="preserve">. Cambridge University Press.</w:t>
       </w:r>
     </w:p>
-    <w:bookmarkEnd w:id="47"/>
-    <w:bookmarkStart w:id="48" w:name="anexo-guía-de-reproducción"/>
+    <w:bookmarkEnd w:id="56"/>
+    <w:bookmarkStart w:id="57" w:name="anexo-guía-de-reproducción"/>
     <w:p>
       <w:pPr>
         <w:pStyle w:val="Heading2"/>
@@ -2472,12 +3118,55 @@
     </w:p>
     <w:p>
       <w:pPr>
+        <w:pStyle w:val="FirstParagraph"/>
+      </w:pPr>
+      <w:r>
+        <w:rPr>
+          <w:b/>
+          <w:bCs/>
+        </w:rPr>
+        <w:t xml:space="preserve">Vía rápida (sin instalar nada más que Docker):</w:t>
+      </w:r>
+    </w:p>
+    <w:p>
+      <w:pPr>
         <w:pStyle w:val="SourceCode"/>
       </w:pPr>
       <w:r>
         <w:rPr>
           <w:rStyle w:val="VerbatimChar"/>
         </w:rPr>
+        <w:t xml:space="preserve">docker compose up --build           # dashboard en :8501 y API en :8010, datos incluidos</w:t>
+      </w:r>
+    </w:p>
+    <w:p>
+      <w:pPr>
+        <w:pStyle w:val="FirstParagraph"/>
+      </w:pPr>
+      <w:r>
+        <w:t xml:space="preserve">Demo pública equivalente: https://tfm-data-science-ufgfhpcvydyrswwzm7t6sz.streamlit.app/</w:t>
+      </w:r>
+    </w:p>
+    <w:p>
+      <w:pPr>
+        <w:pStyle w:val="BodyText"/>
+      </w:pPr>
+      <w:r>
+        <w:rPr>
+          <w:b/>
+          <w:bCs/>
+        </w:rPr>
+        <w:t xml:space="preserve">Vía completa (re-ejecutar el pipeline; Python ≥3.10):</w:t>
+      </w:r>
+    </w:p>
+    <w:p>
+      <w:pPr>
+        <w:pStyle w:val="SourceCode"/>
+      </w:pPr>
+      <w:r>
+        <w:rPr>
+          <w:rStyle w:val="VerbatimChar"/>
+        </w:rPr>
         <w:t xml:space="preserve">python3 -m connectors.&lt;fuente&gt;      # extracción por fuente (raw → processed)</w:t>
       </w:r>
       <w:r>
@@ -2541,7 +3230,7 @@
         <w:rPr>
           <w:rStyle w:val="VerbatimChar"/>
         </w:rPr>
-        <w:t xml:space="preserve">python3 analysis/atlas.py           # 16 figuras del atlas</w:t>
+        <w:t xml:space="preserve">python3 analysis/atlas.py           # figuras del atlas (B1–B19 con suelo e historia)</w:t>
       </w:r>
       <w:r>
         <w:br/>
@@ -2550,7 +3239,7 @@
         <w:rPr>
           <w:rStyle w:val="VerbatimChar"/>
         </w:rPr>
-        <w:t xml:space="preserve">python3 analysis/rendimiento_a1.py  # A1: funnel 164 países</w:t>
+        <w:t xml:space="preserve">python3 analysis/rendimiento_a1.py  # A1 salud: funnel 164 países</w:t>
       </w:r>
       <w:r>
         <w:br/>
@@ -2559,7 +3248,7 @@
         <w:rPr>
           <w:rStyle w:val="VerbatimChar"/>
         </w:rPr>
-        <w:t xml:space="preserve">python3 analysis/escenarios_d1.py   # D1: menú de deuda</w:t>
+        <w:t xml:space="preserve">python3 analysis/expansion_dl.py    # A1 educación + auditoría SPI</w:t>
       </w:r>
       <w:r>
         <w:br/>
@@ -2568,7 +3257,7 @@
         <w:rPr>
           <w:rStyle w:val="VerbatimChar"/>
         </w:rPr>
-        <w:t xml:space="preserve">python3 -m pytest tests/ -q         # 42 tests del contrato de datos y modelos</w:t>
+        <w:t xml:space="preserve">python3 analysis/bienestar_a1.py    # frontera ingreso→bienestar (marco MPI)</w:t>
       </w:r>
       <w:r>
         <w:br/>
@@ -2577,7 +3266,88 @@
         <w:rPr>
           <w:rStyle w:val="VerbatimChar"/>
         </w:rPr>
-        <w:t xml:space="preserve">streamlit run app/dashboard.py      # dashboard MVP</w:t>
+        <w:t xml:space="preserve">python3 analysis/bienestar_panel.py # panel within (parámetros de simulación a 50 años)</w:t>
+      </w:r>
+      <w:r>
+        <w:br/>
+      </w:r>
+      <w:r>
+        <w:rPr>
+          <w:rStyle w:val="VerbatimChar"/>
+        </w:rPr>
+        <w:t xml:space="preserve">python3 analysis/escenarios_d1.py   # D1: menú de deuda 2024–2050</w:t>
+      </w:r>
+      <w:r>
+        <w:br/>
+      </w:r>
+      <w:r>
+        <w:rPr>
+          <w:rStyle w:val="VerbatimChar"/>
+        </w:rPr>
+        <w:t xml:space="preserve">python3 analysis/mc_d1.py           # Monte Carlo de deuda hasta 2070</w:t>
+      </w:r>
+      <w:r>
+        <w:br/>
+      </w:r>
+      <w:r>
+        <w:rPr>
+          <w:rStyle w:val="VerbatimChar"/>
+        </w:rPr>
+        <w:t xml:space="preserve">python3 analysis/bienestar_50.py    # sobres de bienestar 2050/2070</w:t>
+      </w:r>
+      <w:r>
+        <w:br/>
+      </w:r>
+      <w:r>
+        <w:rPr>
+          <w:rStyle w:val="VerbatimChar"/>
+        </w:rPr>
+        <w:t xml:space="preserve">python3 analysis/backtest_50y.py    # calibración histórica de continuidad</w:t>
+      </w:r>
+      <w:r>
+        <w:br/>
+      </w:r>
+      <w:r>
+        <w:rPr>
+          <w:rStyle w:val="VerbatimChar"/>
+        </w:rPr>
+        <w:t xml:space="preserve">python3 analysis/fiscal_breakdown.py    # desglose y reconciliación fiscal mundial</w:t>
+      </w:r>
+      <w:r>
+        <w:br/>
+      </w:r>
+      <w:r>
+        <w:rPr>
+          <w:rStyle w:val="VerbatimChar"/>
+        </w:rPr>
+        <w:t xml:space="preserve">python3 analysis/fiscal_historia.py     # empalme histórico 1703–2025</w:t>
+      </w:r>
+      <w:r>
+        <w:br/>
+      </w:r>
+      <w:r>
+        <w:rPr>
+          <w:rStyle w:val="VerbatimChar"/>
+        </w:rPr>
+        <w:t xml:space="preserve">python3 -m pytest tests/ -q         # 91 tests del contrato de datos y modelos</w:t>
+      </w:r>
+      <w:r>
+        <w:br/>
+      </w:r>
+      <w:r>
+        <w:rPr>
+          <w:rStyle w:val="VerbatimChar"/>
+        </w:rPr>
+        <w:t xml:space="preserve">streamlit run app/dashboard.py      # dashboard (5 pestañas)</w:t>
+      </w:r>
+      <w:r>
+        <w:br/>
+      </w:r>
+      <w:r>
+        <w:rPr>
+          <w:rStyle w:val="VerbatimChar"/>
+        </w:rPr>
+        <w:t xml:space="preserve">python3 app/rag_assistant.py "..."  # asistente RAG sobre la documentación del proyecto</w:t>
       </w:r>
     </w:p>
     <w:p>
@@ -2585,16 +3355,13 @@
         <w:pStyle w:val="FirstParagraph"/>
       </w:pPr>
       <w:r>
-        <w:t xml:space="preserve">Documentos de detalle:</w:t>
-      </w:r>
-      <w:r>
-        <w:t xml:space="preserve"> </w:t>
-      </w:r>
-      <w:r>
-        <w:rPr>
-          <w:rStyle w:val="VerbatimChar"/>
-        </w:rPr>
-        <w:t xml:space="preserve">docs/eda_vivienda.md</w:t>
+        <w:t xml:space="preserve">Los contests DL (</w:t>
+      </w:r>
+      <w:r>
+        <w:rPr>
+          <w:rStyle w:val="VerbatimChar"/>
+        </w:rPr>
+        <w:t xml:space="preserve">foundation_t1.py</w:t>
       </w:r>
       <w:r>
         <w:t xml:space="preserve">,</w:t>
@@ -2606,7 +3373,7 @@
         <w:rPr>
           <w:rStyle w:val="VerbatimChar"/>
         </w:rPr>
-        <w:t xml:space="preserve">docs/backtest_t1_baselines.md</w:t>
+        <w:t xml:space="preserve">dl_global_t1.py</w:t>
       </w:r>
       <w:r>
         <w:t xml:space="preserve">,</w:t>
@@ -2618,98 +3385,59 @@
         <w:rPr>
           <w:rStyle w:val="VerbatimChar"/>
         </w:rPr>
-        <w:t xml:space="preserve">docs/candidatos_t1.md</w:t>
-      </w:r>
-      <w:r>
-        <w:t xml:space="preserve">,</w:t>
-      </w:r>
-      <w:r>
-        <w:t xml:space="preserve"> </w:t>
-      </w:r>
-      <w:r>
-        <w:rPr>
-          <w:rStyle w:val="VerbatimChar"/>
-        </w:rPr>
-        <w:t xml:space="preserve">docs/test_final_t1.md</w:t>
-      </w:r>
-      <w:r>
-        <w:t xml:space="preserve">,</w:t>
-      </w:r>
-      <w:r>
-        <w:t xml:space="preserve"> </w:t>
-      </w:r>
-      <w:r>
-        <w:rPr>
-          <w:rStyle w:val="VerbatimChar"/>
-        </w:rPr>
-        <w:t xml:space="preserve">docs/forecast_t1_mvp.md</w:t>
-      </w:r>
-      <w:r>
-        <w:t xml:space="preserve">,</w:t>
-      </w:r>
-      <w:r>
-        <w:t xml:space="preserve"> </w:t>
-      </w:r>
-      <w:r>
-        <w:rPr>
-          <w:rStyle w:val="VerbatimChar"/>
-        </w:rPr>
-        <w:t xml:space="preserve">docs/atlas.md</w:t>
-      </w:r>
-      <w:r>
-        <w:t xml:space="preserve">,</w:t>
-      </w:r>
-      <w:r>
-        <w:t xml:space="preserve"> </w:t>
-      </w:r>
-      <w:r>
-        <w:rPr>
-          <w:rStyle w:val="VerbatimChar"/>
-        </w:rPr>
-        <w:t xml:space="preserve">docs/rendimiento_a1.md</w:t>
-      </w:r>
-      <w:r>
-        <w:t xml:space="preserve">,</w:t>
-      </w:r>
-      <w:r>
-        <w:t xml:space="preserve"> </w:t>
-      </w:r>
-      <w:r>
-        <w:rPr>
-          <w:rStyle w:val="VerbatimChar"/>
-        </w:rPr>
-        <w:t xml:space="preserve">docs/escenarios_d1.md</w:t>
-      </w:r>
-      <w:r>
-        <w:t xml:space="preserve">,</w:t>
-      </w:r>
-      <w:r>
-        <w:t xml:space="preserve"> </w:t>
-      </w:r>
-      <w:r>
-        <w:rPr>
-          <w:rStyle w:val="VerbatimChar"/>
-        </w:rPr>
-        <w:t xml:space="preserve">docs/oferta_nueva.md</w:t>
-      </w:r>
-      <w:r>
-        <w:t xml:space="preserve">,</w:t>
-      </w:r>
-      <w:r>
-        <w:t xml:space="preserve"> </w:t>
-      </w:r>
-      <w:r>
-        <w:rPr>
-          <w:rStyle w:val="VerbatimChar"/>
-        </w:rPr>
-        <w:t xml:space="preserve">docs/PLAN_MAESTRO.md</w:t>
-      </w:r>
-      <w:r>
-        <w:t xml:space="preserve">.</w:t>
-      </w:r>
-    </w:p>
-    <w:bookmarkEnd w:id="48"/>
-    <w:bookmarkEnd w:id="49"/>
+        <w:t xml:space="preserve">demanda_features.py</w:t>
+      </w:r>
+      <w:r>
+        <w:t xml:space="preserve">) son re-ejecutables pero sus veredictos ya están registrados; el test final de T1 está gastado y no debe usarse para seleccionar. Documentos de detalle: los enlazados en la tabla del README, más</w:t>
+      </w:r>
+      <w:r>
+        <w:t xml:space="preserve"> </w:t>
+      </w:r>
+      <w:r>
+        <w:rPr>
+          <w:rStyle w:val="VerbatimChar"/>
+        </w:rPr>
+        <w:t xml:space="preserve">docs/arquitecturas_prediccion.md</w:t>
+      </w:r>
+      <w:r>
+        <w:t xml:space="preserve"> </w:t>
+      </w:r>
+      <w:r>
+        <w:t xml:space="preserve">(cómo se predice),</w:t>
+      </w:r>
+      <w:r>
+        <w:t xml:space="preserve"> </w:t>
+      </w:r>
+      <w:r>
+        <w:rPr>
+          <w:rStyle w:val="VerbatimChar"/>
+        </w:rPr>
+        <w:t xml:space="preserve">docs/horizonte_50.md</w:t>
+      </w:r>
+      <w:r>
+        <w:t xml:space="preserve"> </w:t>
+      </w:r>
+      <w:r>
+        <w:t xml:space="preserve">(sistema a 50 años) y</w:t>
+      </w:r>
+      <w:r>
+        <w:t xml:space="preserve"> </w:t>
+      </w:r>
+      <w:r>
+        <w:rPr>
+          <w:rStyle w:val="VerbatimChar"/>
+        </w:rPr>
+        <w:t xml:space="preserve">docs/despliegue.md</w:t>
+      </w:r>
+      <w:r>
+        <w:t xml:space="preserve"> </w:t>
+      </w:r>
+      <w:r>
+        <w:t xml:space="preserve">(operación del producto).</w:t>
+      </w:r>
+    </w:p>
+    <w:bookmarkEnd w:id="57"/>
+    <w:bookmarkEnd w:id="58"/>
     <w:sectPr>
       <w:footnotePr>
         <w:numRestart w:val="eachSect"/>

</xml_diff>

<commit_message>
Reencuadre narrativo: capacidad primero, honestidad como fortaleza, lenguaje llano
Sin cambiar ni un numero:
- MEMORIA Resumen reescrito: abre con lo que el sistema HACE (panel de escenarios
  publicado), luego hallazgos, y la honestidad como metodo fiable para saber
  cuando una prediccion es de fiar; jerga fuera o entre parentesis
- MEMORIA Conclusiones reordenadas: 1) sistema publicado 2) respuestas claras
  3) el metodo como aportacion ('reconocer los limites es un resultado, no una
  carencia')
- Deck: diapositiva de conclusiones reencuadrada igual (PNG-verificada)
- Exportes docx/pdf regenerados; deck html/pdf/pptx regenerados
- Motivo: evitar que la lectura 'nada se predice' se malinterprete; el fondo
  no cambia, la narrativa lidera con capacidad

Co-Authored-By: Claude Fable 5 <noreply@anthropic.com>
</commit_message>
<xml_diff>
--- a/docs/MEMORIA.docx
+++ b/docs/MEMORIA.docx
@@ -71,119 +71,23 @@
         <w:pStyle w:val="FirstParagraph"/>
       </w:pPr>
       <w:r>
-        <w:t xml:space="preserve">Este trabajo construye un sistema completo de ciencia de datos sobre una pregunta de interés público:</w:t>
-      </w:r>
-      <w:r>
-        <w:t xml:space="preserve"> </w:t>
-      </w:r>
-      <w:r>
-        <w:rPr>
-          <w:b/>
-          <w:bCs/>
-        </w:rPr>
-        <w:t xml:space="preserve">¿qué obtiene un país (y una comunidad autónoma) a cambio de su dinero público?</w:t>
-      </w:r>
-      <w:r>
-        <w:t xml:space="preserve"> </w:t>
-      </w:r>
-      <w:r>
-        <w:t xml:space="preserve">El sistema comprende: un pipeline reproducible de extracción por capas sobre más de 40 fuentes públicas (INE, Eurostat, FMI, OMS, Banco Mundial, BIS, OCDE, GMD/JST); un</w:t>
-      </w:r>
-      <w:r>
-        <w:t xml:space="preserve"> </w:t>
-      </w:r>
-      <w:r>
-        <w:rPr>
-          <w:b/>
-          <w:bCs/>
-        </w:rPr>
-        <w:t xml:space="preserve">atlas de la evolución del gasto público</w:t>
-      </w:r>
-      <w:r>
-        <w:t xml:space="preserve"> </w:t>
-      </w:r>
-      <w:r>
-        <w:t xml:space="preserve">(figuras B1–B19, con series empalmadas 1703–2025 y su trampa de perímetro medida); un</w:t>
-      </w:r>
-      <w:r>
-        <w:t xml:space="preserve"> </w:t>
-      </w:r>
-      <w:r>
-        <w:rPr>
-          <w:b/>
-          <w:bCs/>
-        </w:rPr>
-        <w:t xml:space="preserve">modelo de pronóstico de la asequibilidad de la vivienda por CCAA</w:t>
-      </w:r>
-      <w:r>
-        <w:t xml:space="preserve"> </w:t>
-      </w:r>
-      <w:r>
-        <w:t xml:space="preserve">seleccionado mediante un protocolo pre-registrado con test final de un solo uso; el</w:t>
-      </w:r>
-      <w:r>
-        <w:t xml:space="preserve"> </w:t>
-      </w:r>
-      <w:r>
-        <w:rPr>
-          <w:b/>
-          <w:bCs/>
-        </w:rPr>
-        <w:t xml:space="preserve">triángulo fiscal completo</w:t>
-      </w:r>
-      <w:r>
-        <w:t xml:space="preserve"> </w:t>
-      </w:r>
-      <w:r>
-        <w:t xml:space="preserve">— gasto por función (COFOG, 89 países), ingresos por tipo (WoRLD, 195) y resultados objetivos de bienestar (marco MPI/MODA de pobreza y pobreza infantil, 13 series) — reconciliado entre fuentes independientes (15/15 checks);</w:t>
-      </w:r>
-      <w:r>
-        <w:t xml:space="preserve"> </w:t>
-      </w:r>
-      <w:r>
-        <w:rPr>
-          <w:b/>
-          <w:bCs/>
-        </w:rPr>
-        <w:t xml:space="preserve">fronteras de rendimiento ajustado</w:t>
-      </w:r>
-      <w:r>
-        <w:t xml:space="preserve"> </w:t>
-      </w:r>
-      <w:r>
-        <w:t xml:space="preserve">en tres dominios (sanidad, educación, bienestar/mortalidad infantil) con incertidumbre conformal; un</w:t>
-      </w:r>
-      <w:r>
-        <w:t xml:space="preserve"> </w:t>
-      </w:r>
-      <w:r>
-        <w:rPr>
-          <w:b/>
-          <w:bCs/>
-        </w:rPr>
-        <w:t xml:space="preserve">simulador de escenarios de deuda</w:t>
-      </w:r>
-      <w:r>
-        <w:t xml:space="preserve"> </w:t>
-      </w:r>
-      <w:r>
-        <w:t xml:space="preserve">2024–2050; y un</w:t>
-      </w:r>
-      <w:r>
-        <w:t xml:space="preserve"> </w:t>
-      </w:r>
-      <w:r>
-        <w:rPr>
-          <w:b/>
-          <w:bCs/>
-        </w:rPr>
-        <w:t xml:space="preserve">producto funcional</w:t>
-      </w:r>
-      <w:r>
-        <w:t xml:space="preserve"> </w:t>
-      </w:r>
-      <w:r>
-        <w:t xml:space="preserve">(API + dashboard + asistente RAG) que sirve todos los resultados con su incertidumbre siempre visible.</w:t>
+        <w:t xml:space="preserve">Este trabajo responde, solo con datos públicos, a una pregunta de interés general:</w:t>
+      </w:r>
+      <w:r>
+        <w:t xml:space="preserve"> </w:t>
+      </w:r>
+      <w:r>
+        <w:rPr>
+          <w:b/>
+          <w:bCs/>
+        </w:rPr>
+        <w:t xml:space="preserve">¿qué obtiene un país —y cada comunidad autónoma— a cambio del dinero público que gasta y recauda?</w:t>
+      </w:r>
+      <w:r>
+        <w:t xml:space="preserve"> </w:t>
+      </w:r>
+      <w:r>
+        <w:t xml:space="preserve">El resultado es un sistema que cualquiera puede usar: un panel interactivo, publicado en internet, donde se pueden plantear preguntas del tipo «¿y si los salarios suben un 2 %?» o «¿y si se recortan a la mitad las ayudas sociales?» y obtener una estimación con su margen de error. Por debajo reúne más de 40 fuentes oficiales (entre otras el INE, Eurostat, el Fondo Monetario Internacional, la OMS y el Banco Mundial), reconstruye la evolución del gasto y los ingresos públicos de España desde 1703 hasta hoy, y mide qué resultados sociales —esperanza de vida, pobreza, pobreza infantil, aprendizaje— compra realmente ese dinero en cerca de 200 países.</w:t>
       </w:r>
     </w:p>
     <w:p>
@@ -191,23 +95,28 @@
         <w:pStyle w:val="BodyText"/>
       </w:pPr>
       <w:r>
-        <w:t xml:space="preserve">El resultado metodológico central no es un modelo, sino una disciplina: todos los criterios de aceptación se fijaron ANTES de comparar modelos, y en los cinco contests de pronóstico (SARIMAX, LightGBM, LightGBM+demanda, modelo fundacional Chronos y DL global entrenado en 1.760 series extranjeras) el campeón simple</w:t>
-      </w:r>
-      <w:r>
-        <w:t xml:space="preserve"> </w:t>
-      </w:r>
-      <w:r>
-        <w:rPr>
-          <w:b/>
-          <w:bCs/>
-        </w:rPr>
-        <w:t xml:space="preserve">no fue batido</w:t>
-      </w:r>
-      <w:r>
-        <w:t xml:space="preserve"> </w:t>
-      </w:r>
-      <w:r>
-        <w:t xml:space="preserve">— el mejor candidato llegó al empate técnico (0,401 vs 0,395 de MASE) y no se adoptó porque la regla exige más; el test final refutó además una hipótesis prometedora en validación y evitó publicar una predicción de desplome del precio de la vivienda en pleno boom. En las fronteras transversales, el OLS ganó las cinco veces al flexible. Los resultados negativos se publican como tales.</w:t>
+        <w:t xml:space="preserve">Los hallazgos son concretos y a menudo contraintuitivos: la vivienda no se vuelve asequible sola, ni siquiera con los salarios creciendo al 4 %; el dinero público que España dedica a construir vivienda es una fracción mínima de lo que invierte el sector privado; entre países, lo que más explica la salud y la caída de la pobreza es la renta, más que el gasto público; y la trayectoria de la deuda depende sobre todo del envejecimiento de la población, por encima de cualquier decisión fiscal concreta. El sistema también localiza señales que se adelantan a los cambios —por ejemplo, la aceleración del crecimiento de la población anticipa las subidas del precio de la vivienda unos dos años y medio.</w:t>
+      </w:r>
+    </w:p>
+    <w:p>
+      <w:pPr>
+        <w:pStyle w:val="BodyText"/>
+      </w:pPr>
+      <w:r>
+        <w:t xml:space="preserve">La aportación central no es un único modelo «ganador», sino un método fiable para saber</w:t>
+      </w:r>
+      <w:r>
+        <w:t xml:space="preserve"> </w:t>
+      </w:r>
+      <w:r>
+        <w:rPr>
+          <w:b/>
+          <w:bCs/>
+        </w:rPr>
+        <w:t xml:space="preserve">cuándo una predicción es de fiar y cuándo sería un espejismo</w:t>
+      </w:r>
+      <w:r>
+        <w:t xml:space="preserve">. Las reglas del juego se fijaron antes de mirar los resultados y luego se dejó que descartaran los modelos más vistosos: cinco modelos sofisticados —incluida una red neuronal entrenada con 1.760 series de precios de otros países— compitieron contra el método más simple posible (suponer que las cosas siguen su tendencia reciente) y ninguno lo superó de forma fiable; en una ocasión ese rigor evitó publicar una predicción de desplome de precios justo cuando el mercado estaba en pleno auge. Por eso el modelo que se entrega es sencillo: no por falta de alternativas, sino porque ganó una competición justa. Esa honestidad —decir con la misma claridad lo que se sabe y lo que no— es lo que separa a este sistema de una respuesta improvisada de una inteligencia artificial, y se demuestra con un experimento propio: sin los datos y los cálculos del sistema, un modelo de lenguaje solo acierta 3 de 12 preguntas; con ellos, 11 de 12.</w:t>
       </w:r>
     </w:p>
     <w:bookmarkEnd w:id="11"/>
@@ -2160,10 +2069,100 @@
           <w:b/>
           <w:bCs/>
         </w:rPr>
+        <w:t xml:space="preserve">Evidencia empírica (ablación,</w:t>
+      </w:r>
+      <w:r>
+        <w:rPr>
+          <w:b/>
+          <w:bCs/>
+        </w:rPr>
+        <w:t xml:space="preserve"> </w:t>
+      </w:r>
+      <w:r>
+        <w:rPr>
+          <w:rStyle w:val="VerbatimChar"/>
+          <w:b/>
+          <w:bCs/>
+        </w:rPr>
+        <w:t xml:space="preserve">docs/ablacion_llm.md</w:t>
+      </w:r>
+      <w:r>
+        <w:rPr>
+          <w:b/>
+          <w:bCs/>
+        </w:rPr>
+        <w:t xml:space="preserve">)</w:t>
+      </w:r>
+      <w:r>
+        <w:t xml:space="preserve">: la afirmación anterior se comprobó como experimento. El mismo LLM (gemini-2.5-pro) respondió 12 preguntas cuya respuesta es una salida del sistema, en dos brazos idénticos salvo la capa de conocimiento: sin el sistema acertó</w:t>
+      </w:r>
+      <w:r>
+        <w:t xml:space="preserve"> </w:t>
+      </w:r>
+      <w:r>
+        <w:rPr>
+          <w:b/>
+          <w:bCs/>
+        </w:rPr>
+        <w:t xml:space="preserve">3/12</w:t>
+      </w:r>
+      <w:r>
+        <w:t xml:space="preserve"> </w:t>
+      </w:r>
+      <w:r>
+        <w:t xml:space="preserve">(error relativo mediano 27 %, con fallos de hasta 2382 %); con los resultados de la capa ML/DL recuperados por RAG,</w:t>
+      </w:r>
+      <w:r>
+        <w:t xml:space="preserve"> </w:t>
+      </w:r>
+      <w:r>
+        <w:rPr>
+          <w:b/>
+          <w:bCs/>
+        </w:rPr>
+        <w:t xml:space="preserve">11/12</w:t>
+      </w:r>
+      <w:r>
+        <w:t xml:space="preserve"> </w:t>
+      </w:r>
+      <w:r>
+        <w:t xml:space="preserve">(error mediano 0 %). Los fallos del LLM solo son del tipo</w:t>
+      </w:r>
+      <w:r>
+        <w:t xml:space="preserve"> </w:t>
+      </w:r>
+      <w:r>
+        <w:t xml:space="preserve">“plausible pero falso”</w:t>
+      </w:r>
+      <w:r>
+        <w:t xml:space="preserve"> </w:t>
+      </w:r>
+      <w:r>
+        <w:t xml:space="preserve">— proyecta la deuda 2050 en 135 % (ignora la presión demográfica que el motor cuantifica en +97 pp) e inventa una correlación suelo-precio de 0,35 donde el panel mide 0,01. La diferencia no es de matiz: es la capa ML/DL lo que produce los números, y sin ella el LLM se equivoca. Un test permanente (</w:t>
+      </w:r>
+      <w:r>
+        <w:rPr>
+          <w:rStyle w:val="VerbatimChar"/>
+        </w:rPr>
+        <w:t xml:space="preserve">tests/test_ablacion.py</w:t>
+      </w:r>
+      <w:r>
+        <w:t xml:space="preserve">) falla si esa diferencia desaparece.</w:t>
+      </w:r>
+    </w:p>
+    <w:p>
+      <w:pPr>
+        <w:pStyle w:val="BodyText"/>
+      </w:pPr>
+      <w:r>
+        <w:rPr>
+          <w:b/>
+          <w:bCs/>
+        </w:rPr>
         <w:t xml:space="preserve">Declaración de uso de IA</w:t>
       </w:r>
       <w:r>
-        <w:t xml:space="preserve">: en este proyecto se emplearon asistentes LLM como herramienta de programación y redacción (proceso), nunca como fuente de los números (producto). El asistente RAG previsto como extensión es el papel correcto de un LLM aquí: interfaz de lenguaje natural SOBRE los artefactos calculados — el LLM narra, el sistema calcula.</w:t>
+        <w:t xml:space="preserve">: en este proyecto se emplearon asistentes LLM como herramienta de programación y redacción (proceso), nunca como fuente de los números (producto). El asistente RAG (motores configurables: kimi, glm, mimo, gemini) es el papel correcto de un LLM aquí: interfaz de lenguaje natural SOBRE los artefactos calculados — el LLM narra, el sistema calcula.</w:t>
       </w:r>
     </w:p>
     <w:bookmarkEnd w:id="51"/>
@@ -2335,7 +2334,17 @@
         </w:numPr>
       </w:pPr>
       <w:r>
-        <w:t xml:space="preserve">Es posible construir, solo con fuentes públicas y código abierto, un sistema completo — datos → modelos → producto — sobre una pregunta de interés público, con estándares de trazabilidad de nivel profesional (vintage, tests de contrato, resultados negativos publicados).</w:t>
+        <w:rPr>
+          <w:b/>
+          <w:bCs/>
+        </w:rPr>
+        <w:t xml:space="preserve">El sistema funciona de principio a fin y está publicado.</w:t>
+      </w:r>
+      <w:r>
+        <w:t xml:space="preserve"> </w:t>
+      </w:r>
+      <w:r>
+        <w:t xml:space="preserve">Cualquiera puede consultarlo, probar sus propios escenarios y ver de dónde sale cada número. Se ha construido solo con fuentes públicas y herramientas abiertas, con una trazabilidad de nivel profesional: cada cifra puede seguirse hasta su descarga original, y todo el proceso se reproduce con un solo comando.</w:t>
       </w:r>
     </w:p>
     <w:p>
@@ -2351,10 +2360,13 @@
           <w:b/>
           <w:bCs/>
         </w:rPr>
-        <w:t xml:space="preserve">La aportación diferencial es la disciplina</w:t>
-      </w:r>
-      <w:r>
-        <w:t xml:space="preserve">: pre-registro, test único, y la voluntad de dejar que las reglas maten a los modelos atractivos. Tres veces ganó lo simple; una vez el protocolo evitó una predicción de desplome en pleno boom. En un TFM, donde la tentación es exhibir el modelo más complejo, este trabajo defiende lo contrario con evidencia propia.</w:t>
+        <w:t xml:space="preserve">Da respuestas claras a la pregunta de fondo.</w:t>
+      </w:r>
+      <w:r>
+        <w:t xml:space="preserve"> </w:t>
+      </w:r>
+      <w:r>
+        <w:t xml:space="preserve">La asequibilidad de la vivienda en España no se corrige sola (ni con salarios al 4 %); lo que el Estado gasta en construir vivienda es muy inferior a lo que invierte el sector privado; entre países, la renta explica la salud y la caída de la pobreza más que el propio gasto público; y el envejecimiento de la población pesa sobre la deuda más que cualquier decisión fiscal individual.</w:t>
       </w:r>
     </w:p>
     <w:p>
@@ -2366,7 +2378,17 @@
         </w:numPr>
       </w:pPr>
       <w:r>
-        <w:t xml:space="preserve">Sustantivamente: la asequibilidad española no se corrige sola (ni con salarios al 4 %); la palanca pública de vivienda es un orden de magnitud menor que la promoción privada; la renta domina el rendimiento sanitario entre países; y la demografía domina la senda de deuda por encima de cualquier palanca fiscal individual.</w:t>
+        <w:rPr>
+          <w:b/>
+          <w:bCs/>
+        </w:rPr>
+        <w:t xml:space="preserve">La aportación que mejor defiende este trabajo es de método: saber dónde se puede predecir y dónde no.</w:t>
+      </w:r>
+      <w:r>
+        <w:t xml:space="preserve"> </w:t>
+      </w:r>
+      <w:r>
+        <w:t xml:space="preserve">Se fijaron las reglas antes de mirar y se dejó que descartaran lo vistoso; ganó lo sencillo, y una vez ese rigor evitó anunciar un desplome de precios en pleno auge. En un trabajo de fin de máster, donde la tentación es lucir el modelo más complejo, aquí se demuestra —con evidencia propia— que un modelo sencillo, bien medido y honesto vale más que uno complejo que solo aparenta acertar. Reconocer los límites de lo predecible no es una carencia del trabajo: es uno de sus resultados.</w:t>
       </w:r>
     </w:p>
     <w:bookmarkEnd w:id="54"/>

</xml_diff>

<commit_message>
Consolidacion de docs: 35 informes sueltos -> 5 compendios tematicos + indice
Estructura nueva de docs/ (por peticion, para no perder al lector):
- CANONICOS standalone: MEMORIA, PLAN_MAESTRO, RECONCILIACION, entregas/, defensa/
- 5 COMPENDIOS: GUIA_USUARIO (6 guias), METODOLOGIA (3), RESULTADOS_VIVIENDA (11),
  RESULTADOS_FISCAL_BIENESTAR (10), DATOS (5)
- INDICE.md: mapa de todo con 'empezar por aqui'
- Encabezados de cada informe degradados un nivel (anidan bajo el compendio);
  referencias cruzadas remapeadas a los nuevos ficheros; nombres sin espacios
- README tabla de docs reescrita; exportes MEMORIA regenerados
- RAG 16 docs/333 pasajes; test de retrieval actualizado al nuevo fichero; 95 verdes

Co-Authored-By: Claude Fable 5 <noreply@anthropic.com>
</commit_message>
<xml_diff>
--- a/docs/MEMORIA.docx
+++ b/docs/MEMORIA.docx
@@ -604,7 +604,7 @@
         <w:rPr>
           <w:rStyle w:val="VerbatimChar"/>
         </w:rPr>
-        <w:t xml:space="preserve">docs/arquitecturas_prediccion.md</w:t>
+        <w:t xml:space="preserve">docs/METODOLOGIA.md</w:t>
       </w:r>
       <w:r>
         <w:t xml:space="preserve">): la predicción</w:t>
@@ -1237,7 +1237,7 @@
         <w:rPr>
           <w:rStyle w:val="VerbatimChar"/>
         </w:rPr>
-        <w:t xml:space="preserve">docs/expansion_corpus.md</w:t>
+        <w:t xml:space="preserve">docs/DATOS.md</w:t>
       </w:r>
       <w:r>
         <w:t xml:space="preserve">) y con ellos tres piezas nuevas. (1)</w:t>
@@ -1365,7 +1365,7 @@
         <w:rPr>
           <w:rStyle w:val="VerbatimChar"/>
         </w:rPr>
-        <w:t xml:space="preserve">docs/demanda_suelo.md</w:t>
+        <w:t xml:space="preserve">docs/RESULTADOS_VIVIENDA.md</w:t>
       </w:r>
       <w:r>
         <w:t xml:space="preserve">): compraventas e hipotecas mensuales por CCAA (INE), población trimestral por CCAA desde 1971 (ECP), mercado de suelo trimestral 2004– (MITMA: número, valor, superficie y precio de transacciones), stock de suelo urbanizable planificado por CCAA (SIU 2021 y 2025) y criterios de crédito vivienda (ECB BLS 2003–). Hallazgos descriptivos: la superficie de suelo transmitida sigue a ~1/5 del pico de 2004 (117→25 millones m²) mientras los precios aceleran, y Madrid reduce su suelo urbanizable (9,4 %→8,9 % con cobertura completa) — la restricción de oferta empieza aguas arriba de los visados. El contest de validación con estas capas como features rezagadas produjo el</w:t>
@@ -1423,7 +1423,7 @@
         <w:rPr>
           <w:rStyle w:val="VerbatimChar"/>
         </w:rPr>
-        <w:t xml:space="preserve">docs/vivienda_global.md</w:t>
+        <w:t xml:space="preserve">docs/RESULTADOS_VIVIENDA.md</w:t>
       </w:r>
       <w:r>
         <w:t xml:space="preserve">, figura b18). España: +46 % real desde 2015 y precio/renta 132,5 (2015=100), en la senda portuguesa (+125 %, 178,8) y lejos de la italiana (−3,7 %, 89,1). El dato incómodo: España es también el país núcleo que más suelo artificial ha creado (+120 % desde 2000, el doble que Alemania) — y transversalmente, en 40 países, Spearman(precio/renta, crecimiento de suelo artificial) = +0,01:</w:t>
@@ -1463,7 +1463,7 @@
         <w:rPr>
           <w:rStyle w:val="VerbatimChar"/>
         </w:rPr>
-        <w:t xml:space="preserve">docs/dl_rutas.md</w:t>
+        <w:t xml:space="preserve">docs/RESULTADOS_VIVIENDA.md</w:t>
       </w:r>
       <w:r>
         <w:t xml:space="preserve">): (a)</w:t>
@@ -1538,7 +1538,7 @@
         <w:rPr>
           <w:rStyle w:val="VerbatimChar"/>
         </w:rPr>
-        <w:t xml:space="preserve">docs/fiscal_breakdown.md</w:t>
+        <w:t xml:space="preserve">docs/RESULTADOS_FISCAL_BIENESTAR.md</w:t>
       </w:r>
       <w:r>
         <w:t xml:space="preserve">). La reconciliación cruzada — 15/15 checks OK en</w:t>
@@ -1592,7 +1592,7 @@
         <w:rPr>
           <w:rStyle w:val="VerbatimChar"/>
         </w:rPr>
-        <w:t xml:space="preserve">docs/fiscal_historia.md</w:t>
+        <w:t xml:space="preserve">docs/RESULTADOS_FISCAL_BIENESTAR.md</w:t>
       </w:r>
       <w:r>
         <w:t xml:space="preserve">). España 1703–2025 queda contada en una sola serie: Estado del 10 % en 1900, transición fiscal 1977–1995 (+15 pp en 18 años, el evento del siglo), déficit crónico solo desde el Estado del bienestar, tijera de 11,5 pp en 2012.</w:t>
@@ -1619,7 +1619,7 @@
         <w:rPr>
           <w:rStyle w:val="VerbatimChar"/>
         </w:rPr>
-        <w:t xml:space="preserve">docs/bienestar_indicadores.md</w:t>
+        <w:t xml:space="preserve">docs/RESULTADOS_FISCAL_BIENESTAR.md</w:t>
       </w:r>
       <w:r>
         <w:t xml:space="preserve">), y la frontera A1 se replica en un tercer dominio con el ingreso público (WoRLD) como dinero de entrada: log-mortalidad &lt;5 (185 países) y stunting (124) ~ ingresos + renta + urbanización, LOOCV, conformal por cuartil. El OLS vuelve a ganar en ambos (GBM no cumple; MLP omitido y declarado). España mejor que lo esperado y dentro de banda (−0,51±0,93); los extremos validan el método (Guinea Ecuatorial ≈8,5× la mortalidad esperada para su renta; Guatemala +29 pp de stunting). Descriptivo del marco completo: Spearman(ingresos públicos, dimensión) entre −0,60 (mortalidad) y +0,56 (agua segura), todas las direcciones correctas — más capacidad fiscal, menos privación en las 7 dimensiones, y la frontera identifica quién convierte mejor a renta comparable. Cierra el triángulo del proyecto: gasto por función + ingresos por tipo + resultados de bienestar objetivos.</w:t>
@@ -1735,7 +1735,7 @@
         <w:rPr>
           <w:rStyle w:val="VerbatimChar"/>
         </w:rPr>
-        <w:t xml:space="preserve">docs/horizonte_50.md</w:t>
+        <w:t xml:space="preserve">docs/RESULTADOS_FISCAL_BIENESTAR.md</w:t>
       </w:r>
       <w:r>
         <w:t xml:space="preserve">): (1) la frontera ingreso→bienestar re-estimada como PANEL within (184 países, FE país+año, CR1): el efecto del ingreso es nulo a 2–5 años y aparece a retardo 8 (−0,0036±0,0015 por pp), ~3× menor que el transversal — simular con el transversal sobrestimaría lo que compra el dinero; la renta domina (γ=−0,51±0,06). (2) Monte Carlo del simulador de deuda con la incertidumbre de parámetros propagada (4.000 trayectorias × escenario; coherente con el menú discreto: central 2050 mediana 231 vs 224, banda 90 % más ancha como debe). (3) Horizonte 2070 (EUROPOP): central mediana 409 % PIB [272–619] — el ancho ES el mensaje. (4) Sobres de bienestar 2050/2070 encadenando solo parámetros within: crecimiento 1 % pc/año → mortalidad &lt;5 −12 %/−21 % vs senda base; la palanca fiscal ±2,5 pp añade ±0,8 % — real pero de segundo orden. (5) Pseudo-backtest de continuidad sobre las DOS ventanas reales de 50 años del panel histórico (1925→1975, 1975→2025): errores medianos 12,7–21,5 pp de PIB congelando, peores extrapolando tendencia (p90 102 pp); España +19 pp (la transición fiscal, invisible para la continuidad).</w:t>
@@ -2084,7 +2084,7 @@
           <w:b/>
           <w:bCs/>
         </w:rPr>
-        <w:t xml:space="preserve">docs/ablacion_llm.md</w:t>
+        <w:t xml:space="preserve">docs/METODOLOGIA.md</w:t>
       </w:r>
       <w:r>
         <w:rPr>
@@ -3419,7 +3419,7 @@
         <w:rPr>
           <w:rStyle w:val="VerbatimChar"/>
         </w:rPr>
-        <w:t xml:space="preserve">docs/arquitecturas_prediccion.md</w:t>
+        <w:t xml:space="preserve">docs/METODOLOGIA.md</w:t>
       </w:r>
       <w:r>
         <w:t xml:space="preserve"> </w:t>
@@ -3434,7 +3434,7 @@
         <w:rPr>
           <w:rStyle w:val="VerbatimChar"/>
         </w:rPr>
-        <w:t xml:space="preserve">docs/horizonte_50.md</w:t>
+        <w:t xml:space="preserve">docs/RESULTADOS_FISCAL_BIENESTAR.md</w:t>
       </w:r>
       <w:r>
         <w:t xml:space="preserve"> </w:t>
@@ -3449,7 +3449,7 @@
         <w:rPr>
           <w:rStyle w:val="VerbatimChar"/>
         </w:rPr>
-        <w:t xml:space="preserve">docs/despliegue.md</w:t>
+        <w:t xml:space="preserve">docs/GUIA_USUARIO.md</w:t>
       </w:r>
       <w:r>
         <w:t xml:space="preserve"> </w:t>

</xml_diff>

<commit_message>
Nuevo titulo del proyecto: 'El precio de lo publico' (antes 'Dinero publico -> Resultados')
- Reemplazo en 12 ficheros (README, MEMORIA, panel, API, RAG, deck, plan,
  scripts, anexo); subtitulo aclaratorio en README, dashboard y portada del deck
  ('Que recibe un pais a cambio del dinero que gasta y recauda')
- Exportes MEMORIA regenerados; RAG rebuild; 95 tests verdes
- La descripcion 'About' de GitHub ya estaba en lenguaje llano (no contenia el titulo)

Co-Authored-By: Claude Fable 5 <noreply@anthropic.com>
</commit_message>
<xml_diff>
--- a/docs/MEMORIA.docx
+++ b/docs/MEMORIA.docx
@@ -2,13 +2,13 @@
 <file path=word/document.xml><?xml version="1.0" encoding="utf-8"?>
 <w:document xmlns:w="http://schemas.openxmlformats.org/wordprocessingml/2006/main" xmlns:m="http://schemas.openxmlformats.org/officeDocument/2006/math" xmlns:r="http://schemas.openxmlformats.org/officeDocument/2006/relationships" xmlns:o="urn:schemas-microsoft-com:office:office" xmlns:v="urn:schemas-microsoft-com:vml" xmlns:w10="urn:schemas-microsoft-com:office:word" xmlns:a="http://schemas.openxmlformats.org/drawingml/2006/main" xmlns:pic="http://schemas.openxmlformats.org/drawingml/2006/picture" xmlns:wp="http://schemas.openxmlformats.org/drawingml/2006/wordprocessingDrawing">
   <w:body>
-    <w:bookmarkStart w:id="58" w:name="dinero-público-resultados"/>
+    <w:bookmarkStart w:id="58" w:name="el-precio-de-lo-público"/>
     <w:p>
       <w:pPr>
         <w:pStyle w:val="Heading1"/>
       </w:pPr>
       <w:r>
-        <w:t xml:space="preserve">Dinero público → Resultados</w:t>
+        <w:t xml:space="preserve">El precio de lo público</w:t>
       </w:r>
     </w:p>
     <w:bookmarkStart w:id="10" w:name="Xb0ba2edb737fabd94bbb803bf36949f76125b47"/>

</xml_diff>

<commit_message>
Saneo de cuentas obsoletas por la expansion (tests, datasets, figuras, fuentes)
- MEMORIA: processed 32->67, gold 9->23, 42->95 tests, atlas B1-B16->B1-B19, 51->95 tests
- README estado actual: 91->95 tests
- deck (fuente+render): 30->40 fuentes, 51->95 tests, tabla LLM 91->95 tests
- GUIA_USUARIO: recuento del corpus RAG hecho version-agnostico (apunta al manifest)
- Exportes MEMORIA y deck html/pdf/pptx regenerados; RAG rebuild; 95 tests verdes
- Compendios: los recuentos por-modulo restantes son narrativa historica (estado
  al cerrar cada modulo), se conservan; entregas 01-03 y _old intactos

Co-Authored-By: Claude Fable 5 <noreply@anthropic.com>
</commit_message>
<xml_diff>
--- a/docs/MEMORIA.docx
+++ b/docs/MEMORIA.docx
@@ -310,7 +310,7 @@
         <w:t xml:space="preserve">processed</w:t>
       </w:r>
       <w:r>
-        <w:t xml:space="preserve">: un fichero por fuente, limpieza trazable (32 datasets).</w:t>
+        <w:t xml:space="preserve">: un fichero por fuente, limpieza trazable (67 datasets).</w:t>
       </w:r>
     </w:p>
     <w:p>
@@ -329,7 +329,7 @@
         <w:t xml:space="preserve">gold</w:t>
       </w:r>
       <w:r>
-        <w:t xml:space="preserve">: 9 datasets finales de consumo, con clave primaria verificada y tests automáticos (</w:t>
+        <w:t xml:space="preserve">: 23 datasets finales de consumo, con clave primaria verificada y tests automáticos (</w:t>
       </w:r>
       <w:r>
         <w:rPr>
@@ -338,7 +338,7 @@
         <w:t xml:space="preserve">tests/</w:t>
       </w:r>
       <w:r>
-        <w:t xml:space="preserve">, 42 tests): paneles fiscal europeo y mundial-histórico, panel CCAA trimestral, asequibilidad anual, proyecciones demográficas, y los tres artefactos de resultados (pronóstico, rendimiento, escenarios).</w:t>
+        <w:t xml:space="preserve">, 95 tests): paneles fiscal europeo y mundial-histórico, panel CCAA trimestral, asequibilidad anual, proyecciones demográficas, y los tres artefactos de resultados (pronóstico, rendimiento, escenarios).</w:t>
       </w:r>
     </w:p>
     <w:bookmarkEnd w:id="16"/>
@@ -944,13 +944,13 @@
       </w:r>
     </w:p>
     <w:bookmarkEnd w:id="28"/>
-    <w:bookmarkStart w:id="32" w:name="atlas-b1b16-el-siglo-del-gasto-público"/>
+    <w:bookmarkStart w:id="32" w:name="atlas-b1b19-el-siglo-del-gasto-público"/>
     <w:p>
       <w:pPr>
         <w:pStyle w:val="Heading3"/>
       </w:pPr>
       <w:r>
-        <w:t xml:space="preserve">4.2 Atlas B1–B16 — el siglo del gasto público</w:t>
+        <w:t xml:space="preserve">4.2 Atlas B1–B19 — el siglo del gasto público</w:t>
       </w:r>
     </w:p>
     <w:p>
@@ -2030,7 +2030,7 @@
         <w:t xml:space="preserve">Reproducibilidad</w:t>
       </w:r>
       <w:r>
-        <w:t xml:space="preserve">: mismo código + mismos datos → mismos números, con 51 tests que lo blindan (el tercer bug del parser lo cazó un test; el número erróneo de un LLM es silencioso para siempre).</w:t>
+        <w:t xml:space="preserve">: mismo código + mismos datos → mismos números, con 95 tests que lo blindan (el tercer bug del parser lo cazó un test; el número erróneo de un LLM es silencioso para siempre).</w:t>
       </w:r>
     </w:p>
     <w:p>
@@ -3351,7 +3351,7 @@
         <w:rPr>
           <w:rStyle w:val="VerbatimChar"/>
         </w:rPr>
-        <w:t xml:space="preserve">python3 -m pytest tests/ -q         # 91 tests del contrato de datos y modelos</w:t>
+        <w:t xml:space="preserve">python3 -m pytest tests/ -q         # 95 tests del contrato de datos y modelos</w:t>
       </w:r>
       <w:r>
         <w:br/>

</xml_diff>